<commit_message>
Clarify r650 CXL emulation failure wording
</commit_message>
<xml_diff>
--- a/sherman_report.docx
+++ b/sherman_report.docx
@@ -59,7 +59,13 @@
     </w:p>
     <w:p>
       <w:r>
-        <w:t>Across both platforms, the missing uniform/skewed separation remained. The initial r650 NUMA-based CXL emulation measured about a 99.9% index-cache hit rate and little measurable difference from the baseline, suggesting that the large index cache absorbed most remote-memory effects. A later cache-size sensitivity run reduced kIndexCacheSize from 1000 MB to 4 MB after a 64 MB trial still produced near-99% hit rates. With 4 MB, the in-run cache hit rates dropped to roughly 33-65% and latency increased, but the hit rates were still rising after 150 seconds, so those numbers should be interpreted as non-steady-state sensitivity evidence rather than final stable performance.</w:t>
+        <w:t xml:space="preserve">Across both platforms, the missing uniform/skewed separation remained. </w:t>
+      </w:r>
+      <w:r>
+        <w:t>The initial r650 NUMA-based CXL emulation measured about a 99.9% index-cache hit rate. Most skewed workloads showed little measurable difference from the baseline, while the uniform write-only run showed an anomalous improvement that is more likely due to run-to-run variance than a real CXL benefit</w:t>
+      </w:r>
+      <w:r>
+        <w:t>. A later cache-size sensitivity run reduced kIndexCacheSize from 1000 MB to 4 MB after a 64 MB trial still produced near-99% hit rates. With 4 MB, the in-run cache hit rates dropped to roughly 32-65% and latency increased, but the hit rates were still rising after 150 seconds, so those numbers should be interpreted as non-steady-state sensitivity evidence rather than final stable performance.</w:t>
       </w:r>
     </w:p>
     <w:p>
@@ -72,7 +78,16 @@
     </w:p>
     <w:p>
       <w:r>
-        <w:t>Sherman is a write-optimized distributed B+Tree index designed for disaggregated memory. Its main idea is Hardware-Offloaded Concurrent Locks (HOCL), which use the on-chip SRAM of RDMA NICs as a lock table and thereby reduce remote RDMA round-trips during lock acquisition. In the paper, this design yields 24.7x higher throughput on write-only workloads and 23.6x higher throughput on write-intensive skewed workloads relative to FG+.</w:t>
+        <w:t xml:space="preserve">Sherman is a write-optimized distributed B+Tree index designed for disaggregated memory. Its main idea is </w:t>
+      </w:r>
+      <w:r>
+        <w:t>Hierarchical On-Chip Lock</w:t>
+      </w:r>
+      <w:r>
+        <w:t xml:space="preserve"> </w:t>
+      </w:r>
+      <w:r>
+        <w:t>(HOCL), which use the on-chip SRAM of RDMA NICs as a lock table and thereby reduce remote RDMA round-trips during lock acquisition. In the paper, this design yields 24.7x higher throughput on write-only workloads and 23.6x higher throughput on write-intensive skewed workloads relative to FG+.</w:t>
       </w:r>
     </w:p>
     <w:p/>
@@ -90,6 +105,7 @@
         </w:tabs>
       </w:pPr>
       <w:r>
+        <w:lastRenderedPageBreak/>
         <w:t>2. Experimental Setup and Why the Platform Changed</w:t>
       </w:r>
     </w:p>
@@ -103,8 +119,7 @@
     </w:p>
     <w:p>
       <w:r>
-        <w:lastRenderedPageBreak/>
-        <w:t>We used a reduced two-node CloudLab deployment, with one memory server and one compute server per node, instead of the paper's 16-node setup. The study started on c6525-100g machines in the Utah cluster, where we collected the main reproduction results. Later, when the project turned to CXL-style remote-memory emulation, we moved that follow-up stage to r650 machines in the Clemson cluster because only the dual-socket r650 exposes a remote NUMA node.</w:t>
+        <w:t>We used a reduced two-physical-node CloudLab deployment, with one Memory Server role and one Compute Server role per node. In contrast, the Sherman paper used 8 physical servers and emulated one MS and one CS on each server, giving 8 MSs + 8 CSs as logical roles and 176 total client threads. The study started on c6525-100g machines in the Utah cluster, where we collected the main reproduction results. Later, when the project turned to CXL-style remote-memory emulation, we moved that follow-up stage to r650 machines in the Clemson cluster because only the dual-socket r650 exposes a remote NUMA node.</w:t>
       </w:r>
     </w:p>
     <w:p/>
@@ -123,13 +138,7 @@
     </w:p>
     <w:p>
       <w:r>
-        <w:t>Table 1 separates the paper's setup from the two platforms used in this report and makes their roles explicit. c6525-100g is the initial reproduction platform. r650 becomes the dual-socket follow-up platform after the CXL</w:t>
-      </w:r>
-      <w:r>
-        <w:t xml:space="preserve"> implementation</w:t>
-      </w:r>
-      <w:r>
-        <w:t>, and that move also creates a useful cross-platform comparison for interpreting the c6525-100g results.</w:t>
+        <w:t>Table 1 separates physical server count from MS/CS logical roles, then compares the paper's Section 5.1 setup with the two platforms used in this report. c6525-100g is the initial reproduction platform. r650 becomes the dual-socket follow-up platform after the CXL implementation, and that move also creates a useful cross-platform comparison for interpreting the c6525-100g results.</w:t>
       </w:r>
     </w:p>
     <w:p>
@@ -287,11 +296,7 @@
           </w:tcPr>
           <w:p>
             <w:r>
-              <w:rPr>
-                <w:sz w:val="20"/>
-                <w:szCs w:val="20"/>
-              </w:rPr>
-              <w:t>Nodes</w:t>
+              <w:t>Physical servers / logical roles</w:t>
             </w:r>
           </w:p>
         </w:tc>
@@ -308,11 +313,7 @@
           </w:tcPr>
           <w:p>
             <w:r>
-              <w:rPr>
-                <w:sz w:val="20"/>
-                <w:szCs w:val="20"/>
-              </w:rPr>
-              <w:t>8 MSs + 8 CSs (16 total)</w:t>
+              <w:t>8 physical servers; 8 MS + 8 CS logical roles (1 MS + 1 CS per server)</w:t>
             </w:r>
           </w:p>
         </w:tc>
@@ -329,11 +330,7 @@
           </w:tcPr>
           <w:p>
             <w:r>
-              <w:rPr>
-                <w:sz w:val="20"/>
-                <w:szCs w:val="20"/>
-              </w:rPr>
-              <w:t>2x CloudLab c6525-100g (Utah)</w:t>
+              <w:t>2 physical c6525-100g nodes; 2 MS + 2 CS roles (1 MS + 1 CS per node)</w:t>
             </w:r>
           </w:p>
         </w:tc>
@@ -350,11 +347,7 @@
           </w:tcPr>
           <w:p>
             <w:r>
-              <w:rPr>
-                <w:sz w:val="20"/>
-                <w:szCs w:val="20"/>
-              </w:rPr>
-              <w:t>2x CloudLab r650 (Clemson)</w:t>
+              <w:t>2 physical r650 nodes; 2 MS + 2 CS roles (1 MS + 1 CS per node)</w:t>
             </w:r>
           </w:p>
         </w:tc>
@@ -549,6 +542,7 @@
                 <w:sz w:val="20"/>
                 <w:szCs w:val="20"/>
               </w:rPr>
+              <w:lastRenderedPageBreak/>
               <w:t>NIC (experiment)</w:t>
             </w:r>
           </w:p>
@@ -807,7 +801,6 @@
                 <w:sz w:val="20"/>
                 <w:szCs w:val="20"/>
               </w:rPr>
-              <w:lastRenderedPageBreak/>
               <w:t>NUMA nodes</w:t>
             </w:r>
           </w:p>
@@ -997,11 +990,7 @@
           </w:tcPr>
           <w:p>
             <w:r>
-              <w:rPr>
-                <w:sz w:val="20"/>
-                <w:szCs w:val="20"/>
-              </w:rPr>
-              <w:t>22/node (176 total)</w:t>
+              <w:t>22 per CS (176 total)</w:t>
             </w:r>
           </w:p>
         </w:tc>
@@ -1139,6 +1128,7 @@
         <w:pStyle w:val="Heading2"/>
       </w:pPr>
       <w:r>
+        <w:lastRenderedPageBreak/>
         <w:t>3.3 RDMA Network Interface Selection</w:t>
       </w:r>
     </w:p>
@@ -1157,7 +1147,6 @@
     </w:p>
     <w:p>
       <w:r>
-        <w:lastRenderedPageBreak/>
         <w:t>Sherman uses memcached_increment on the key serverNum to assign node IDs. If that key is missing, the benchmark hangs. After each run, stale QP connection keys can also prevent the next run's Queue Pairs from reaching Ready-to-Send (RTS) state. We therefore initialized serverNum before each run and cleared stale coordination state between runs.</w:t>
       </w:r>
     </w:p>
@@ -1184,7 +1173,7 @@
     </w:p>
     <w:p>
       <w:r>
-        <w:t>For the r650 CXL-style experiment, process-level NUMA binding was not sufficient. Using numactl --cpunodebind=0 --membind=1 on the Memory Server caused RDMA memory registration to fail at ibv_reg_mr(). The practical workaround was to configure hugepage placement directly through sysfs: clear the 2MB hugepage pool on NUMA node 0, allocate 5120 2MB hugepages on NUMA node 1, and then launch Sherman normally. Because the NIC PCIe path remains attached to node 0 while the Memory Server's hugepages come from node 1, Sherman transparently uses remote DRAM without requiring code changes.</w:t>
+        <w:t>For the r650 CXL-style experiment, process-level NUMA binding was not sufficient. When we tried to force the Memory Server process onto NUMA node 1 with numactl --membind=1, the CXL-style run failed with a bus error. Separately, in the RDMA initialization path, incorrect or incompatible memory placement can also surface around RDMA memory registration, such as ibv_reg_mr() failure. The practical workaround for the CXL-style experiment was therefore to configure hugepage placement directly through sysfs: clear the 2MB hugepage pool on NUMA node 0, allocate 5120 2MB hugepages on NUMA node 1, and then launch Sherman normally. Because the NIC PCIe path remains attached to node 0 while the Memory Server's hugepages come from node 1, Sherman transparently uses remote DRAM without requiring code changes.</w:t>
       </w:r>
     </w:p>
     <w:p>
@@ -1279,6 +1268,7 @@
                 <w:sz w:val="20"/>
                 <w:szCs w:val="20"/>
               </w:rPr>
+              <w:lastRenderedPageBreak/>
               <w:t>Workload</w:t>
             </w:r>
           </w:p>
@@ -1966,7 +1956,6 @@
     <w:p/>
     <w:p>
       <w:r>
-        <w:lastRenderedPageBreak/>
         <w:t>Throughput rises from 3.06 to 9.75 Mops as the read ratio increases, in the same direction as the paper. The write-heavy workloads also show higher p99 latency, around 173 us. One possible explanation is the lack of PFC configuration for RoCE v2 on CloudLab's experiment network, although we did not directly measure retransmissions.</w:t>
       </w:r>
     </w:p>
@@ -2039,6 +2028,7 @@
         <w:rPr>
           <w:noProof/>
         </w:rPr>
+        <w:lastRenderedPageBreak/>
         <w:drawing>
           <wp:inline distT="0" distB="0" distL="0" distR="0" wp14:anchorId="1B000002" wp14:editId="77777777">
             <wp:extent cx="5486400" cy="3200400"/>
@@ -2675,11 +2665,7 @@
           </w:tcPr>
           <w:p>
             <w:r>
-              <w:rPr>
-                <w:sz w:val="20"/>
-                <w:szCs w:val="20"/>
-              </w:rPr>
-              <w:t>209</w:t>
+              <w:t>659</w:t>
             </w:r>
           </w:p>
         </w:tc>
@@ -2845,11 +2831,7 @@
           </w:tcPr>
           <w:p>
             <w:r>
-              <w:rPr>
-                <w:sz w:val="20"/>
-                <w:szCs w:val="20"/>
-              </w:rPr>
-              <w:t>47</w:t>
+              <w:t>12.3</w:t>
             </w:r>
           </w:p>
         </w:tc>
@@ -2863,6 +2845,7 @@
     </w:p>
     <w:p>
       <w:r>
+        <w:lastRenderedPageBreak/>
         <w:t>Because the main mismatch in our reproduction is the missing separation between uniform and skewed write-heavy workloads, the next subsection asks whether reduced lock-table capacity is a plausible explanation within our environment.</w:t>
       </w:r>
     </w:p>
@@ -2874,7 +2857,6 @@
         <w:rPr>
           <w:noProof/>
         </w:rPr>
-        <w:lastRenderedPageBreak/>
         <w:drawing>
           <wp:inline distT="0" distB="0" distL="0" distR="0" wp14:anchorId="1B000003" wp14:editId="77777777">
             <wp:extent cx="5486400" cy="3474720"/>
@@ -2995,12 +2977,12 @@
         <w:pStyle w:val="Heading2"/>
       </w:pPr>
       <w:r>
+        <w:lastRenderedPageBreak/>
         <w:t>4.3 Observed Limitation: Lock Table Saturation</w:t>
       </w:r>
     </w:p>
     <w:p>
       <w:r>
-        <w:lastRenderedPageBreak/>
         <w:t>The lock table contains far fewer entries in our setup: kLockChipMemSize = 64KB, so kNumOfLock = 64*1024 / sizeof(uint64_t) = 8,192 entries, which is 16x fewer than the paper's 131,072. Part of that reduction comes from the open-source repository using uint64_t rather than the paper's 16-bit CAS-based representation.</w:t>
       </w:r>
     </w:p>
@@ -3066,7 +3048,7 @@
     <w:p/>
     <w:p>
       <w:r>
-        <w:t>Uniform and skewed write-only workloads produced essentially the same result: 3.06 Mops cluster throughput in both cases, with p99 latency of 173 us versus 174 us, a difference below 0.3%. That is consistent with nearly the same lock-contention behavior under the constraints of our setup.</w:t>
+        <w:t>Uniform and skewed write-only workloads produced essentially the same result: 3.06 Mops cluster throughput in both cases, with p99 latency of 173 us versus 174 us, a difference of about 0.6%. That is consistent with nearly the same lock-contention behavior under the constraints of our setup.</w:t>
       </w:r>
     </w:p>
     <w:p/>
@@ -3145,16 +3127,16 @@
     </w:p>
     <w:p>
       <w:r>
-        <w:t xml:space="preserve">Several parts of the reproduction remain close to the paper. Throughput increases monotonically with read ratio for both uniform and skewed workloads (write-only &lt; write-intensive &lt; read-intensive), which matches Sherman's design. p50 latency is also close to the paper for write-only (8.0 us versus 10.7 us) and write-intensive (6.5 us versus 8.0 us) workloads, both within 15%. That is consistent with some fast-path behavior being close to the paper, but we did not directly instrument RDMA verb counts or B+Tree </w:t>
+        <w:t xml:space="preserve">Several parts of the reproduction remain close to the paper. Throughput increases monotonically with read ratio for both uniform and skewed workloads (write-only &lt; write-intensive &lt; read-intensive), which matches Sherman's design. In the uniform table, p50 latency is also in the same single-digit-microsecond range as the paper for write-only (8.0 us versus 10.7 us) and write-intensive (6.5 us versus 8.0 us) </w:t>
       </w:r>
       <w:r>
         <w:lastRenderedPageBreak/>
-        <w:t>traversal depth, so latency alone cannot establish those mechanisms. Read-intensive p99 latency (12.9 us) is likewise very close to the paper's 12.1 us, which is consistent with reads bypassing the lock table.</w:t>
-      </w:r>
-    </w:p>
-    <w:p>
-      <w:r>
-        <w:t>The differences are also substantial. Absolute throughput is 4 to 5x lower across all workloads; for example, uniform write-only reaches 3.06 Mops here versus 16.04 Mops in the paper. The clearest reason is scale: the paper uses 8 Memory Servers and 8 Compute Servers, for 176 total threads, while our setup uses 2 nodes and 44 threads. A 4x reduction in thread count would be expected to lower aggregate throughput accordingly. Another difference is that the paper's uniform/skewed throughput separation, such as 16.04 versus 4.14 Mops for write-only, disappears in our results, where both cases are 3.06 Mops. That pattern is consistent with lock-table saturation. With only 8,192 HOCL entries, or 16x fewer than the paper's 131,072, both access patterns may hit the same bottleneck and therefore lose the separation reported in the paper. We also see elevated p99 latency for uniform write-heavy workloads (173 us versus 17.5 us). One plausible explanation is that Priority Flow Control was not configured for RoCE v2 on the CloudLab experiment network, which could increase RDMA retransmission and inflate tail latency; the much less affected p50 is consistent with that explanation. Overall, we were not able to reproduce the paper's large separation between uniform and skewed write-heavy workloads, and reduced HOCL capacity remains the most plausible explanation supported by our setup and measurements.</w:t>
+        <w:t>workloads, with gaps of roughly 19-25% relative to the paper values. That is consistent with some fast-path behavior being close to the paper, but we did not directly instrument RDMA verb counts or B+Tree traversal depth, so latency alone cannot establish those mechanisms. Uniform read-intensive p99 latency (12.9 us) is likewise very close to the paper's 12.1 us, which is consistent with reads bypassing the lock table.</w:t>
+      </w:r>
+    </w:p>
+    <w:p>
+      <w:r>
+        <w:t>The differences are also substantial. Absolute throughput is lower in every c6525 workload, but the size of the gap varies by workload; for example, uniform write-only reaches 3.06 Mops here versus 16.04 Mops in the paper. The clearest reason is scale: the paper uses 8 physical servers that emulate 8 Memory Server roles and 8 Compute Server roles, with 176 total client threads, while our setup uses 2 physical nodes and 44 threads. A 4x reduction in thread count would be expected to lower aggregate throughput accordingly. Another difference is that the paper's uniform/skewed throughput separation, such as 16.04 versus 4.14 Mops for write-only, disappears in our results, where both cases are 3.06 Mops. That pattern is consistent with lock-table saturation. With only 8,192 HOCL entries, or 16x fewer than the paper's 131,072, both access patterns may hit the same bottleneck and therefore lose the separation reported in the paper. We also see elevated p99 latency for uniform write-heavy workloads (173 us versus 17.5 us). One plausible explanation is that Priority Flow Control was not configured for RoCE v2 on the CloudLab experiment network, which could increase RDMA retransmission and inflate tail latency; the much less affected p50 is consistent with that explanation. Overall, we were not able to reproduce the paper's large separation between uniform and skewed write-heavy workloads, and reduced HOCL capacity remains the most plausible explanation supported by our setup and measurements.</w:t>
       </w:r>
     </w:p>
     <w:p/>
@@ -3227,7 +3209,11 @@
     </w:p>
     <w:p>
       <w:r>
-        <w:t>Section 4 established the main reproduction behavior on c6525-100g, but it also exposed the next question: could we examine remote-memory sensitivity more directly? The answer on c6525-100g was no, because the machine is single-socket and cannot provide a remote NUMA node. That limitation forced a pivot to r650. The move is important for two reasons. First, it enables the dual-socket CXL-style emulation that c6525-100g cannot support. Second, it turns the later stage of the project into a cross-platform comparison, because r650 changes socket topology, CPU family, NIC generation, and HOCL on-chip memory size at the same time.</w:t>
+        <w:t>Section 4 established the main reproduction behavior on c6525-100g, but it also exposed the next question: could we examine remote-memory sensitivity more directly? The answer on c6525-100g was no, because the machine is single-socket and cannot provide a remote NUMA node. That limitation forced a pivot to r650. The move is important for two reasons. First, it enables the dual-socket CXL-style emulation that c6525-100g cannot support. Second, it turns the later stage of the project into a cross-</w:t>
+      </w:r>
+      <w:r>
+        <w:lastRenderedPageBreak/>
+        <w:t>platform comparison, because r650 changes socket topology, CPU family, NIC generation, and HOCL on-chip memory size at the same time.</w:t>
       </w:r>
     </w:p>
     <w:p/>
@@ -3236,7 +3222,6 @@
         <w:pStyle w:val="Heading2"/>
       </w:pPr>
       <w:r>
-        <w:lastRenderedPageBreak/>
         <w:t>5.1 Why r650 Became the Follow-Up Platform</w:t>
       </w:r>
     </w:p>
@@ -3626,11 +3611,7 @@
           </w:tcPr>
           <w:p>
             <w:r>
-              <w:rPr>
-                <w:sz w:val="20"/>
-                <w:szCs w:val="20"/>
-              </w:rPr>
-              <w:t>Hugepage migration to node 1 (numactl --membind=1 caused bus error)</w:t>
+              <w:t>Hugepage migration to NUMA node 1; numactl-based memory binding caused a bus error in the CXL-style run, so remote-memory placement was enforced through sysfs hugepage allocation instead.</w:t>
             </w:r>
           </w:p>
         </w:tc>
@@ -4254,6 +4235,7 @@
                 <w:sz w:val="20"/>
                 <w:szCs w:val="20"/>
               </w:rPr>
+              <w:lastRenderedPageBreak/>
               <w:t>Read-intensive</w:t>
             </w:r>
           </w:p>
@@ -4416,7 +4398,6 @@
         <w:rPr>
           <w:noProof/>
         </w:rPr>
-        <w:lastRenderedPageBreak/>
         <w:drawing>
           <wp:inline distT="0" distB="0" distL="0" distR="0" wp14:anchorId="1B000005" wp14:editId="77777777">
             <wp:extent cx="5486400" cy="3474720"/>
@@ -5046,11 +5027,7 @@
           </w:tcPr>
           <w:p>
             <w:r>
-              <w:rPr>
-                <w:sz w:val="20"/>
-                <w:szCs w:val="20"/>
-              </w:rPr>
-              <w:t>209</w:t>
+              <w:t>659</w:t>
             </w:r>
           </w:p>
         </w:tc>
@@ -5216,11 +5193,7 @@
           </w:tcPr>
           <w:p>
             <w:r>
-              <w:rPr>
-                <w:sz w:val="20"/>
-                <w:szCs w:val="20"/>
-              </w:rPr>
-              <w:t>47</w:t>
+              <w:t>12.3</w:t>
             </w:r>
           </w:p>
         </w:tc>
@@ -7845,6 +7818,7 @@
         <w:pStyle w:val="Heading2"/>
       </w:pPr>
       <w:r>
+        <w:lastRenderedPageBreak/>
         <w:t>5.5 Sensitivity Analysis of CXL Emulation</w:t>
       </w:r>
     </w:p>
@@ -7873,9 +7847,7 @@
     </w:p>
     <w:tbl>
       <w:tblPr>
-        <w:tblW w:type="auto" w:w="0"/>
-        <w:tblLayout w:type="fixed"/>
-        <w:tblLook w:firstColumn="1" w:firstRow="1" w:lastColumn="0" w:lastRow="0" w:noHBand="0" w:noVBand="1" w:val="04A0"/>
+        <w:tblW w:w="0" w:type="auto"/>
         <w:tblBorders>
           <w:top w:val="single" w:sz="4" w:space="0" w:color="BFBFBF"/>
           <w:left w:val="single" w:sz="4" w:space="0" w:color="BFBFBF"/>
@@ -7884,29 +7856,27 @@
           <w:insideH w:val="single" w:sz="4" w:space="0" w:color="BFBFBF"/>
           <w:insideV w:val="single" w:sz="4" w:space="0" w:color="BFBFBF"/>
         </w:tblBorders>
+        <w:tblLayout w:type="fixed"/>
         <w:tblCellMar>
           <w:left w:w="40" w:type="dxa"/>
           <w:right w:w="40" w:type="dxa"/>
         </w:tblCellMar>
+        <w:tblLook w:val="04A0" w:firstRow="1" w:lastRow="0" w:firstColumn="1" w:lastColumn="0" w:noHBand="0" w:noVBand="1"/>
       </w:tblPr>
       <w:tblGrid>
-        <w:gridCol w:w="1872"/>
-        <w:gridCol w:w="1872"/>
-        <w:gridCol w:w="1872"/>
-        <w:gridCol w:w="1872"/>
+        <w:gridCol w:w="2800"/>
+        <w:gridCol w:w="1900"/>
+        <w:gridCol w:w="1250"/>
+        <w:gridCol w:w="1500"/>
       </w:tblGrid>
       <w:tr>
         <w:tc>
           <w:tcPr>
-            <w:tcW w:type="dxa" w:w="2800"/>
+            <w:tcW w:w="2800" w:type="dxa"/>
             <w:shd w:val="clear" w:color="auto" w:fill="2E75B6"/>
             <w:vAlign w:val="center"/>
           </w:tcPr>
           <w:p>
-            <w:pPr>
-              <w:jc w:val="left"/>
-            </w:pPr>
-            <w:r/>
             <w:r>
               <w:rPr>
                 <w:b/>
@@ -7919,7 +7889,7 @@
         </w:tc>
         <w:tc>
           <w:tcPr>
-            <w:tcW w:type="dxa" w:w="1900"/>
+            <w:tcW w:w="1900" w:type="dxa"/>
             <w:shd w:val="clear" w:color="auto" w:fill="2E75B6"/>
             <w:vAlign w:val="center"/>
           </w:tcPr>
@@ -7927,7 +7897,6 @@
             <w:pPr>
               <w:jc w:val="center"/>
             </w:pPr>
-            <w:r/>
             <w:r>
               <w:rPr>
                 <w:b/>
@@ -7940,7 +7909,7 @@
         </w:tc>
         <w:tc>
           <w:tcPr>
-            <w:tcW w:type="dxa" w:w="1250"/>
+            <w:tcW w:w="1250" w:type="dxa"/>
             <w:shd w:val="clear" w:color="auto" w:fill="2E75B6"/>
             <w:vAlign w:val="center"/>
           </w:tcPr>
@@ -7948,7 +7917,6 @@
             <w:pPr>
               <w:jc w:val="center"/>
             </w:pPr>
-            <w:r/>
             <w:r>
               <w:rPr>
                 <w:b/>
@@ -7961,7 +7929,7 @@
         </w:tc>
         <w:tc>
           <w:tcPr>
-            <w:tcW w:type="dxa" w:w="1500"/>
+            <w:tcW w:w="1500" w:type="dxa"/>
             <w:shd w:val="clear" w:color="auto" w:fill="2E75B6"/>
             <w:vAlign w:val="center"/>
           </w:tcPr>
@@ -7969,7 +7937,6 @@
             <w:pPr>
               <w:jc w:val="center"/>
             </w:pPr>
-            <w:r/>
             <w:r>
               <w:rPr>
                 <w:b/>
@@ -7984,15 +7951,11 @@
       <w:tr>
         <w:tc>
           <w:tcPr>
-            <w:tcW w:type="dxa" w:w="2800"/>
+            <w:tcW w:w="2800" w:type="dxa"/>
             <w:shd w:val="clear" w:color="auto" w:fill="FFFFFF"/>
             <w:vAlign w:val="center"/>
           </w:tcPr>
           <w:p>
-            <w:pPr>
-              <w:jc w:val="left"/>
-            </w:pPr>
-            <w:r/>
             <w:r>
               <w:rPr>
                 <w:sz w:val="18"/>
@@ -8003,7 +7966,7 @@
         </w:tc>
         <w:tc>
           <w:tcPr>
-            <w:tcW w:type="dxa" w:w="1900"/>
+            <w:tcW w:w="1900" w:type="dxa"/>
             <w:shd w:val="clear" w:color="auto" w:fill="FFFFFF"/>
             <w:vAlign w:val="center"/>
           </w:tcPr>
@@ -8011,7 +7974,6 @@
             <w:pPr>
               <w:jc w:val="center"/>
             </w:pPr>
-            <w:r/>
             <w:r>
               <w:rPr>
                 <w:sz w:val="18"/>
@@ -8022,7 +7984,7 @@
         </w:tc>
         <w:tc>
           <w:tcPr>
-            <w:tcW w:type="dxa" w:w="1250"/>
+            <w:tcW w:w="1250" w:type="dxa"/>
             <w:shd w:val="clear" w:color="auto" w:fill="FFFFFF"/>
             <w:vAlign w:val="center"/>
           </w:tcPr>
@@ -8030,7 +7992,6 @@
             <w:pPr>
               <w:jc w:val="center"/>
             </w:pPr>
-            <w:r/>
             <w:r>
               <w:rPr>
                 <w:sz w:val="18"/>
@@ -8041,7 +8002,7 @@
         </w:tc>
         <w:tc>
           <w:tcPr>
-            <w:tcW w:type="dxa" w:w="1500"/>
+            <w:tcW w:w="1500" w:type="dxa"/>
             <w:shd w:val="clear" w:color="auto" w:fill="FFFFFF"/>
             <w:vAlign w:val="center"/>
           </w:tcPr>
@@ -8049,7 +8010,6 @@
             <w:pPr>
               <w:jc w:val="center"/>
             </w:pPr>
-            <w:r/>
             <w:r>
               <w:rPr>
                 <w:sz w:val="18"/>
@@ -8062,15 +8022,11 @@
       <w:tr>
         <w:tc>
           <w:tcPr>
-            <w:tcW w:type="dxa" w:w="2800"/>
+            <w:tcW w:w="2800" w:type="dxa"/>
             <w:shd w:val="clear" w:color="auto" w:fill="FFFFFF"/>
             <w:vAlign w:val="center"/>
           </w:tcPr>
           <w:p>
-            <w:pPr>
-              <w:jc w:val="left"/>
-            </w:pPr>
-            <w:r/>
             <w:r>
               <w:rPr>
                 <w:sz w:val="18"/>
@@ -8081,7 +8037,7 @@
         </w:tc>
         <w:tc>
           <w:tcPr>
-            <w:tcW w:type="dxa" w:w="1900"/>
+            <w:tcW w:w="1900" w:type="dxa"/>
             <w:shd w:val="clear" w:color="auto" w:fill="FFFFFF"/>
             <w:vAlign w:val="center"/>
           </w:tcPr>
@@ -8089,7 +8045,6 @@
             <w:pPr>
               <w:jc w:val="center"/>
             </w:pPr>
-            <w:r/>
             <w:r>
               <w:rPr>
                 <w:sz w:val="18"/>
@@ -8100,7 +8055,7 @@
         </w:tc>
         <w:tc>
           <w:tcPr>
-            <w:tcW w:type="dxa" w:w="1250"/>
+            <w:tcW w:w="1250" w:type="dxa"/>
             <w:shd w:val="clear" w:color="auto" w:fill="FFFFFF"/>
             <w:vAlign w:val="center"/>
           </w:tcPr>
@@ -8108,7 +8063,6 @@
             <w:pPr>
               <w:jc w:val="center"/>
             </w:pPr>
-            <w:r/>
             <w:r>
               <w:rPr>
                 <w:sz w:val="18"/>
@@ -8119,7 +8073,7 @@
         </w:tc>
         <w:tc>
           <w:tcPr>
-            <w:tcW w:type="dxa" w:w="1500"/>
+            <w:tcW w:w="1500" w:type="dxa"/>
             <w:shd w:val="clear" w:color="auto" w:fill="FFFFFF"/>
             <w:vAlign w:val="center"/>
           </w:tcPr>
@@ -8127,7 +8081,6 @@
             <w:pPr>
               <w:jc w:val="center"/>
             </w:pPr>
-            <w:r/>
             <w:r>
               <w:rPr>
                 <w:sz w:val="18"/>
@@ -8140,15 +8093,11 @@
       <w:tr>
         <w:tc>
           <w:tcPr>
-            <w:tcW w:type="dxa" w:w="2800"/>
+            <w:tcW w:w="2800" w:type="dxa"/>
             <w:shd w:val="clear" w:color="auto" w:fill="FFFFFF"/>
             <w:vAlign w:val="center"/>
           </w:tcPr>
           <w:p>
-            <w:pPr>
-              <w:jc w:val="left"/>
-            </w:pPr>
-            <w:r/>
             <w:r>
               <w:rPr>
                 <w:sz w:val="18"/>
@@ -8159,7 +8108,7 @@
         </w:tc>
         <w:tc>
           <w:tcPr>
-            <w:tcW w:type="dxa" w:w="1900"/>
+            <w:tcW w:w="1900" w:type="dxa"/>
             <w:shd w:val="clear" w:color="auto" w:fill="FFFFFF"/>
             <w:vAlign w:val="center"/>
           </w:tcPr>
@@ -8167,7 +8116,6 @@
             <w:pPr>
               <w:jc w:val="center"/>
             </w:pPr>
-            <w:r/>
             <w:r>
               <w:rPr>
                 <w:sz w:val="18"/>
@@ -8178,7 +8126,7 @@
         </w:tc>
         <w:tc>
           <w:tcPr>
-            <w:tcW w:type="dxa" w:w="1250"/>
+            <w:tcW w:w="1250" w:type="dxa"/>
             <w:shd w:val="clear" w:color="auto" w:fill="FFFFFF"/>
             <w:vAlign w:val="center"/>
           </w:tcPr>
@@ -8186,7 +8134,6 @@
             <w:pPr>
               <w:jc w:val="center"/>
             </w:pPr>
-            <w:r/>
             <w:r>
               <w:rPr>
                 <w:sz w:val="18"/>
@@ -8197,7 +8144,7 @@
         </w:tc>
         <w:tc>
           <w:tcPr>
-            <w:tcW w:type="dxa" w:w="1500"/>
+            <w:tcW w:w="1500" w:type="dxa"/>
             <w:shd w:val="clear" w:color="auto" w:fill="FFFFFF"/>
             <w:vAlign w:val="center"/>
           </w:tcPr>
@@ -8205,7 +8152,6 @@
             <w:pPr>
               <w:jc w:val="center"/>
             </w:pPr>
-            <w:r/>
             <w:r>
               <w:rPr>
                 <w:sz w:val="18"/>
@@ -8218,15 +8164,11 @@
       <w:tr>
         <w:tc>
           <w:tcPr>
-            <w:tcW w:type="dxa" w:w="2800"/>
+            <w:tcW w:w="2800" w:type="dxa"/>
             <w:shd w:val="clear" w:color="auto" w:fill="FFFFFF"/>
             <w:vAlign w:val="center"/>
           </w:tcPr>
           <w:p>
-            <w:pPr>
-              <w:jc w:val="left"/>
-            </w:pPr>
-            <w:r/>
             <w:r>
               <w:rPr>
                 <w:sz w:val="18"/>
@@ -8237,7 +8179,7 @@
         </w:tc>
         <w:tc>
           <w:tcPr>
-            <w:tcW w:type="dxa" w:w="1900"/>
+            <w:tcW w:w="1900" w:type="dxa"/>
             <w:shd w:val="clear" w:color="auto" w:fill="FFFFFF"/>
             <w:vAlign w:val="center"/>
           </w:tcPr>
@@ -8245,7 +8187,6 @@
             <w:pPr>
               <w:jc w:val="center"/>
             </w:pPr>
-            <w:r/>
             <w:r>
               <w:rPr>
                 <w:sz w:val="18"/>
@@ -8256,7 +8197,7 @@
         </w:tc>
         <w:tc>
           <w:tcPr>
-            <w:tcW w:type="dxa" w:w="1250"/>
+            <w:tcW w:w="1250" w:type="dxa"/>
             <w:shd w:val="clear" w:color="auto" w:fill="FFFFFF"/>
             <w:vAlign w:val="center"/>
           </w:tcPr>
@@ -8264,7 +8205,6 @@
             <w:pPr>
               <w:jc w:val="center"/>
             </w:pPr>
-            <w:r/>
             <w:r>
               <w:rPr>
                 <w:sz w:val="18"/>
@@ -8275,7 +8215,7 @@
         </w:tc>
         <w:tc>
           <w:tcPr>
-            <w:tcW w:type="dxa" w:w="1500"/>
+            <w:tcW w:w="1500" w:type="dxa"/>
             <w:shd w:val="clear" w:color="auto" w:fill="FFFFFF"/>
             <w:vAlign w:val="center"/>
           </w:tcPr>
@@ -8283,7 +8223,6 @@
             <w:pPr>
               <w:jc w:val="center"/>
             </w:pPr>
-            <w:r/>
             <w:r>
               <w:rPr>
                 <w:sz w:val="18"/>
@@ -8296,15 +8235,11 @@
       <w:tr>
         <w:tc>
           <w:tcPr>
-            <w:tcW w:type="dxa" w:w="2800"/>
+            <w:tcW w:w="2800" w:type="dxa"/>
             <w:shd w:val="clear" w:color="auto" w:fill="FFFFFF"/>
             <w:vAlign w:val="center"/>
           </w:tcPr>
           <w:p>
-            <w:pPr>
-              <w:jc w:val="left"/>
-            </w:pPr>
-            <w:r/>
             <w:r>
               <w:rPr>
                 <w:sz w:val="18"/>
@@ -8315,7 +8250,7 @@
         </w:tc>
         <w:tc>
           <w:tcPr>
-            <w:tcW w:type="dxa" w:w="1900"/>
+            <w:tcW w:w="1900" w:type="dxa"/>
             <w:shd w:val="clear" w:color="auto" w:fill="FFFFFF"/>
             <w:vAlign w:val="center"/>
           </w:tcPr>
@@ -8323,7 +8258,6 @@
             <w:pPr>
               <w:jc w:val="center"/>
             </w:pPr>
-            <w:r/>
             <w:r>
               <w:rPr>
                 <w:sz w:val="18"/>
@@ -8334,7 +8268,7 @@
         </w:tc>
         <w:tc>
           <w:tcPr>
-            <w:tcW w:type="dxa" w:w="1250"/>
+            <w:tcW w:w="1250" w:type="dxa"/>
             <w:shd w:val="clear" w:color="auto" w:fill="FFFFFF"/>
             <w:vAlign w:val="center"/>
           </w:tcPr>
@@ -8342,7 +8276,6 @@
             <w:pPr>
               <w:jc w:val="center"/>
             </w:pPr>
-            <w:r/>
             <w:r>
               <w:rPr>
                 <w:sz w:val="18"/>
@@ -8353,7 +8286,7 @@
         </w:tc>
         <w:tc>
           <w:tcPr>
-            <w:tcW w:type="dxa" w:w="1500"/>
+            <w:tcW w:w="1500" w:type="dxa"/>
             <w:shd w:val="clear" w:color="auto" w:fill="FFFFFF"/>
             <w:vAlign w:val="center"/>
           </w:tcPr>
@@ -8361,7 +8294,6 @@
             <w:pPr>
               <w:jc w:val="center"/>
             </w:pPr>
-            <w:r/>
             <w:r>
               <w:rPr>
                 <w:sz w:val="18"/>
@@ -8374,15 +8306,11 @@
       <w:tr>
         <w:tc>
           <w:tcPr>
-            <w:tcW w:type="dxa" w:w="2800"/>
+            <w:tcW w:w="2800" w:type="dxa"/>
             <w:shd w:val="clear" w:color="auto" w:fill="FFFFFF"/>
             <w:vAlign w:val="center"/>
           </w:tcPr>
           <w:p>
-            <w:pPr>
-              <w:jc w:val="left"/>
-            </w:pPr>
-            <w:r/>
             <w:r>
               <w:rPr>
                 <w:sz w:val="18"/>
@@ -8393,7 +8321,7 @@
         </w:tc>
         <w:tc>
           <w:tcPr>
-            <w:tcW w:type="dxa" w:w="1900"/>
+            <w:tcW w:w="1900" w:type="dxa"/>
             <w:shd w:val="clear" w:color="auto" w:fill="FFFFFF"/>
             <w:vAlign w:val="center"/>
           </w:tcPr>
@@ -8401,7 +8329,6 @@
             <w:pPr>
               <w:jc w:val="center"/>
             </w:pPr>
-            <w:r/>
             <w:r>
               <w:rPr>
                 <w:sz w:val="18"/>
@@ -8412,7 +8339,7 @@
         </w:tc>
         <w:tc>
           <w:tcPr>
-            <w:tcW w:type="dxa" w:w="1250"/>
+            <w:tcW w:w="1250" w:type="dxa"/>
             <w:shd w:val="clear" w:color="auto" w:fill="FFFFFF"/>
             <w:vAlign w:val="center"/>
           </w:tcPr>
@@ -8420,7 +8347,6 @@
             <w:pPr>
               <w:jc w:val="center"/>
             </w:pPr>
-            <w:r/>
             <w:r>
               <w:rPr>
                 <w:sz w:val="18"/>
@@ -8431,7 +8357,7 @@
         </w:tc>
         <w:tc>
           <w:tcPr>
-            <w:tcW w:type="dxa" w:w="1500"/>
+            <w:tcW w:w="1500" w:type="dxa"/>
             <w:shd w:val="clear" w:color="auto" w:fill="FFFFFF"/>
             <w:vAlign w:val="center"/>
           </w:tcPr>
@@ -8439,7 +8365,6 @@
             <w:pPr>
               <w:jc w:val="center"/>
             </w:pPr>
-            <w:r/>
             <w:r>
               <w:rPr>
                 <w:sz w:val="18"/>
@@ -8451,7 +8376,6 @@
       </w:tr>
     </w:tbl>
     <w:p>
-      <w:pPr/>
       <w:r>
         <w:t>The reduced-cache run changes the interpretation of the earlier 99.9% result. With the larger index cache, all six workloads reached about 99.9% cache hit rate and the CXL-emulated throughput stayed close to the original high-hit-rate CXL run. With the 4 MB index cache, the hit rates dropped to roughly 32-65%, p99 latency increased for most workloads, and throughput was lower than the original CXL run for most workloads. Figures 12a and 12b compare the two CXL settings directly. This is consistent with the teacher's suggestion that the 1000 MB cache was absorbing most of the remote-DRAM effect. Because the 4 MB cache was still warming up, the result should be treated as sensitivity evidence rather than a final stable performance point.</w:t>
       </w:r>
@@ -8461,22 +8385,27 @@
         <w:jc w:val="center"/>
       </w:pPr>
       <w:r>
+        <w:rPr>
+          <w:noProof/>
+        </w:rPr>
+        <w:lastRenderedPageBreak/>
         <w:drawing>
-          <wp:inline xmlns:a="http://schemas.openxmlformats.org/drawingml/2006/main" xmlns:pic="http://schemas.openxmlformats.org/drawingml/2006/picture">
+          <wp:inline distT="0" distB="0" distL="0" distR="0" wp14:anchorId="5BDBCDC1" wp14:editId="1A713D02">
             <wp:extent cx="5760720" cy="3640366"/>
+            <wp:effectExtent l="0" t="0" r="0" b="0"/>
             <wp:docPr id="1261574679" name="Picture 1261574679"/>
             <wp:cNvGraphicFramePr>
-              <a:graphicFrameLocks noChangeAspect="1"/>
+              <a:graphicFrameLocks xmlns:a="http://schemas.openxmlformats.org/drawingml/2006/main" noChangeAspect="1"/>
             </wp:cNvGraphicFramePr>
-            <a:graphic>
+            <a:graphic xmlns:a="http://schemas.openxmlformats.org/drawingml/2006/main">
               <a:graphicData uri="http://schemas.openxmlformats.org/drawingml/2006/picture">
-                <pic:pic>
+                <pic:pic xmlns:pic="http://schemas.openxmlformats.org/drawingml/2006/picture">
                   <pic:nvPicPr>
                     <pic:cNvPr id="0" name="r650_cxl_cache4m_vs_original_throughput.png"/>
                     <pic:cNvPicPr/>
                   </pic:nvPicPr>
                   <pic:blipFill>
-                    <a:blip r:embed="rId27"/>
+                    <a:blip r:embed="rId20"/>
                     <a:stretch>
                       <a:fillRect/>
                     </a:stretch>
@@ -8486,7 +8415,9 @@
                       <a:off x="0" y="0"/>
                       <a:ext cx="5760720" cy="3640366"/>
                     </a:xfrm>
-                    <a:prstGeom prst="rect"/>
+                    <a:prstGeom prst="rect">
+                      <a:avLst/>
+                    </a:prstGeom>
                   </pic:spPr>
                 </pic:pic>
               </a:graphicData>
@@ -8513,22 +8444,26 @@
         <w:jc w:val="center"/>
       </w:pPr>
       <w:r>
+        <w:rPr>
+          <w:noProof/>
+        </w:rPr>
         <w:drawing>
-          <wp:inline xmlns:a="http://schemas.openxmlformats.org/drawingml/2006/main" xmlns:pic="http://schemas.openxmlformats.org/drawingml/2006/picture">
+          <wp:inline distT="0" distB="0" distL="0" distR="0" wp14:anchorId="053E2BAE" wp14:editId="3D1E5D4C">
             <wp:extent cx="5760720" cy="3640366"/>
+            <wp:effectExtent l="0" t="0" r="0" b="0"/>
             <wp:docPr id="1261574680" name="Picture 1261574680"/>
             <wp:cNvGraphicFramePr>
-              <a:graphicFrameLocks noChangeAspect="1"/>
+              <a:graphicFrameLocks xmlns:a="http://schemas.openxmlformats.org/drawingml/2006/main" noChangeAspect="1"/>
             </wp:cNvGraphicFramePr>
-            <a:graphic>
+            <a:graphic xmlns:a="http://schemas.openxmlformats.org/drawingml/2006/main">
               <a:graphicData uri="http://schemas.openxmlformats.org/drawingml/2006/picture">
-                <pic:pic>
+                <pic:pic xmlns:pic="http://schemas.openxmlformats.org/drawingml/2006/picture">
                   <pic:nvPicPr>
                     <pic:cNvPr id="0" name="r650_cxl_cache4m_vs_original_p99.png"/>
                     <pic:cNvPicPr/>
                   </pic:nvPicPr>
                   <pic:blipFill>
-                    <a:blip r:embed="rId28"/>
+                    <a:blip r:embed="rId21"/>
                     <a:stretch>
                       <a:fillRect/>
                     </a:stretch>
@@ -8538,7 +8473,9 @@
                       <a:off x="0" y="0"/>
                       <a:ext cx="5760720" cy="3640366"/>
                     </a:xfrm>
-                    <a:prstGeom prst="rect"/>
+                    <a:prstGeom prst="rect">
+                      <a:avLst/>
+                    </a:prstGeom>
                   </pic:spPr>
                 </pic:pic>
               </a:graphicData>
@@ -8583,7 +8520,7 @@
     <w:p/>
     <w:p>
       <w:r>
-        <w:t>In the extended analysis, NUMA-based CXL emulation via hugepage migration first measured about a 99.9% index-cache hit rate across all workloads and little measurable performance difference from the baseline. After reducing the index cache to 4 MB, the hit rate fell to roughly 33-65% during the 150-second runs and the remote-memory effect became more visible in latency and throughput. However, because the cache hit rates were still climbing, the 4 MB results should be interpreted as sensitivity evidence, not as steady-state performance. Overall, the results suggest that Sherman's HOCL behavior is sensitive to NIC on-chip memory capacity and the lock-entry representation used in the open-source code, while remote-memory sensitivity depends strongly on how much of the tree traversal the CS-side index cache absorbs.</w:t>
+        <w:t>In the extended analysis, NUMA-based CXL emulation via hugepage migration first measured about a 99.9% index-cache hit rate across all workloads and little measurable performance difference from the baseline. After reducing the index cache to 4 MB, the hit rate fell to roughly 32-65% during the 150-second runs and the remote-memory effect became more visible in latency and throughput. However, because the cache hit rates were still climbing, the 4 MB results should be interpreted as sensitivity evidence, not as steady-state performance. Overall, the results suggest that Sherman's HOCL behavior is sensitive to NIC on-chip memory capacity and the lock-entry representation used in the open-source code, while remote-memory sensitivity depends strongly on how much of the tree traversal the CS-side index cache absorbs.</w:t>
       </w:r>
     </w:p>
     <w:p/>
@@ -8626,9 +8563,9 @@
         <w:tblLook w:val="04A0" w:firstRow="1" w:lastRow="0" w:firstColumn="1" w:lastColumn="0" w:noHBand="0" w:noVBand="1"/>
       </w:tblPr>
       <w:tblGrid>
-        <w:gridCol w:w="2203"/>
-        <w:gridCol w:w="3497"/>
-        <w:gridCol w:w="3660"/>
+        <w:gridCol w:w="2405"/>
+        <w:gridCol w:w="3301"/>
+        <w:gridCol w:w="3654"/>
       </w:tblGrid>
       <w:tr>
         <w:trPr>
@@ -8636,7 +8573,7 @@
         </w:trPr>
         <w:tc>
           <w:tcPr>
-            <w:tcW w:w="2200" w:type="dxa"/>
+            <w:tcW w:w="2405" w:type="dxa"/>
             <w:shd w:val="clear" w:color="auto" w:fill="2E75B6"/>
             <w:tcMar>
               <w:top w:w="80" w:type="dxa"/>
@@ -8660,7 +8597,7 @@
         </w:tc>
         <w:tc>
           <w:tcPr>
-            <w:tcW w:w="3500" w:type="dxa"/>
+            <w:tcW w:w="3301" w:type="dxa"/>
             <w:shd w:val="clear" w:color="auto" w:fill="2E75B6"/>
             <w:tcMar>
               <w:top w:w="80" w:type="dxa"/>
@@ -8684,7 +8621,7 @@
         </w:tc>
         <w:tc>
           <w:tcPr>
-            <w:tcW w:w="3660" w:type="dxa"/>
+            <w:tcW w:w="3654" w:type="dxa"/>
             <w:shd w:val="clear" w:color="auto" w:fill="2E75B6"/>
             <w:tcMar>
               <w:top w:w="80" w:type="dxa"/>
@@ -8710,7 +8647,7 @@
       <w:tr>
         <w:tc>
           <w:tcPr>
-            <w:tcW w:w="2200" w:type="dxa"/>
+            <w:tcW w:w="2405" w:type="dxa"/>
             <w:shd w:val="clear" w:color="auto" w:fill="FFFFFF"/>
             <w:tcMar>
               <w:top w:w="80" w:type="dxa"/>
@@ -8731,7 +8668,7 @@
         </w:tc>
         <w:tc>
           <w:tcPr>
-            <w:tcW w:w="3500" w:type="dxa"/>
+            <w:tcW w:w="3301" w:type="dxa"/>
             <w:shd w:val="clear" w:color="auto" w:fill="FFFFFF"/>
             <w:tcMar>
               <w:top w:w="80" w:type="dxa"/>
@@ -8752,7 +8689,7 @@
         </w:tc>
         <w:tc>
           <w:tcPr>
-            <w:tcW w:w="3660" w:type="dxa"/>
+            <w:tcW w:w="3654" w:type="dxa"/>
             <w:shd w:val="clear" w:color="auto" w:fill="FFFFFF"/>
             <w:tcMar>
               <w:top w:w="80" w:type="dxa"/>
@@ -8775,7 +8712,7 @@
       <w:tr>
         <w:tc>
           <w:tcPr>
-            <w:tcW w:w="2200" w:type="dxa"/>
+            <w:tcW w:w="2405" w:type="dxa"/>
             <w:shd w:val="clear" w:color="auto" w:fill="FFFFFF"/>
             <w:tcMar>
               <w:top w:w="80" w:type="dxa"/>
@@ -8796,7 +8733,7 @@
         </w:tc>
         <w:tc>
           <w:tcPr>
-            <w:tcW w:w="3500" w:type="dxa"/>
+            <w:tcW w:w="3301" w:type="dxa"/>
             <w:shd w:val="clear" w:color="auto" w:fill="FFFFFF"/>
             <w:tcMar>
               <w:top w:w="80" w:type="dxa"/>
@@ -8817,7 +8754,7 @@
         </w:tc>
         <w:tc>
           <w:tcPr>
-            <w:tcW w:w="3660" w:type="dxa"/>
+            <w:tcW w:w="3654" w:type="dxa"/>
             <w:shd w:val="clear" w:color="auto" w:fill="FFFFFF"/>
             <w:tcMar>
               <w:top w:w="80" w:type="dxa"/>
@@ -8840,28 +8777,29 @@
       <w:tr>
         <w:tc>
           <w:tcPr>
-            <w:tcW w:w="2200" w:type="dxa"/>
-            <w:shd w:val="clear" w:color="auto" w:fill="FFFFFF"/>
-            <w:tcMar>
-              <w:top w:w="80" w:type="dxa"/>
-              <w:left w:w="120" w:type="dxa"/>
-              <w:bottom w:w="80" w:type="dxa"/>
-              <w:right w:w="120" w:type="dxa"/>
-            </w:tcMar>
-          </w:tcPr>
-          <w:p>
-            <w:r>
-              <w:rPr>
-                <w:sz w:val="20"/>
-                <w:szCs w:val="20"/>
-              </w:rPr>
+            <w:tcW w:w="2405" w:type="dxa"/>
+            <w:shd w:val="clear" w:color="auto" w:fill="FFFFFF"/>
+            <w:tcMar>
+              <w:top w:w="80" w:type="dxa"/>
+              <w:left w:w="120" w:type="dxa"/>
+              <w:bottom w:w="80" w:type="dxa"/>
+              <w:right w:w="120" w:type="dxa"/>
+            </w:tcMar>
+          </w:tcPr>
+          <w:p>
+            <w:r>
+              <w:rPr>
+                <w:sz w:val="20"/>
+                <w:szCs w:val="20"/>
+              </w:rPr>
+              <w:lastRenderedPageBreak/>
               <w:t>results/c6525_baseline/</w:t>
             </w:r>
           </w:p>
         </w:tc>
         <w:tc>
           <w:tcPr>
-            <w:tcW w:w="3500" w:type="dxa"/>
+            <w:tcW w:w="3301" w:type="dxa"/>
             <w:shd w:val="clear" w:color="auto" w:fill="FFFFFF"/>
             <w:tcMar>
               <w:top w:w="80" w:type="dxa"/>
@@ -8878,7 +8816,7 @@
         </w:tc>
         <w:tc>
           <w:tcPr>
-            <w:tcW w:w="3660" w:type="dxa"/>
+            <w:tcW w:w="3654" w:type="dxa"/>
             <w:shd w:val="clear" w:color="auto" w:fill="FFFFFF"/>
             <w:tcMar>
               <w:top w:w="80" w:type="dxa"/>
@@ -8901,7 +8839,7 @@
       <w:tr>
         <w:tc>
           <w:tcPr>
-            <w:tcW w:w="2200" w:type="dxa"/>
+            <w:tcW w:w="2405" w:type="dxa"/>
             <w:shd w:val="clear" w:color="auto" w:fill="FFFFFF"/>
             <w:tcMar>
               <w:top w:w="80" w:type="dxa"/>
@@ -8922,7 +8860,7 @@
         </w:tc>
         <w:tc>
           <w:tcPr>
-            <w:tcW w:w="3500" w:type="dxa"/>
+            <w:tcW w:w="3301" w:type="dxa"/>
             <w:shd w:val="clear" w:color="auto" w:fill="FFFFFF"/>
             <w:tcMar>
               <w:top w:w="80" w:type="dxa"/>
@@ -8939,7 +8877,7 @@
         </w:tc>
         <w:tc>
           <w:tcPr>
-            <w:tcW w:w="3660" w:type="dxa"/>
+            <w:tcW w:w="3654" w:type="dxa"/>
             <w:shd w:val="clear" w:color="auto" w:fill="FFFFFF"/>
             <w:tcMar>
               <w:top w:w="80" w:type="dxa"/>
@@ -8962,7 +8900,7 @@
       <w:tr>
         <w:tc>
           <w:tcPr>
-            <w:tcW w:w="2200" w:type="dxa"/>
+            <w:tcW w:w="2405" w:type="dxa"/>
             <w:shd w:val="clear" w:color="auto" w:fill="FFFFFF"/>
             <w:tcMar>
               <w:top w:w="80" w:type="dxa"/>
@@ -8983,7 +8921,7 @@
         </w:tc>
         <w:tc>
           <w:tcPr>
-            <w:tcW w:w="3500" w:type="dxa"/>
+            <w:tcW w:w="3301" w:type="dxa"/>
             <w:shd w:val="clear" w:color="auto" w:fill="FFFFFF"/>
             <w:tcMar>
               <w:top w:w="80" w:type="dxa"/>
@@ -9000,7 +8938,7 @@
         </w:tc>
         <w:tc>
           <w:tcPr>
-            <w:tcW w:w="3660" w:type="dxa"/>
+            <w:tcW w:w="3654" w:type="dxa"/>
             <w:shd w:val="clear" w:color="auto" w:fill="FFFFFF"/>
             <w:tcMar>
               <w:top w:w="80" w:type="dxa"/>
@@ -9023,15 +8961,11 @@
       <w:tr>
         <w:tc>
           <w:tcPr>
-            <w:tcW w:type="dxa" w:w="2203"/>
+            <w:tcW w:w="2405" w:type="dxa"/>
             <w:shd w:val="clear" w:color="auto" w:fill="FFFFFF"/>
             <w:vAlign w:val="center"/>
           </w:tcPr>
           <w:p>
-            <w:pPr>
-              <w:jc w:val="left"/>
-            </w:pPr>
-            <w:r/>
             <w:r>
               <w:rPr>
                 <w:sz w:val="20"/>
@@ -9042,38 +8976,24 @@
         </w:tc>
         <w:tc>
           <w:tcPr>
-            <w:tcW w:type="dxa" w:w="3497"/>
+            <w:tcW w:w="3301" w:type="dxa"/>
             <w:shd w:val="clear" w:color="auto" w:fill="FFFFFF"/>
             <w:vAlign w:val="center"/>
           </w:tcPr>
           <w:p>
-            <w:pPr>
-              <w:jc w:val="left"/>
-            </w:pPr>
-            <w:r/>
-            <w:r>
-              <w:rPr>
-                <w:sz w:val="20"/>
-              </w:rPr>
+            <w:r>
               <w:t>Reduced-index-cache CXL-emulated output (6 workloads)</w:t>
             </w:r>
           </w:p>
         </w:tc>
         <w:tc>
           <w:tcPr>
-            <w:tcW w:type="dxa" w:w="3660"/>
+            <w:tcW w:w="3654" w:type="dxa"/>
             <w:shd w:val="clear" w:color="auto" w:fill="FFFFFF"/>
             <w:vAlign w:val="center"/>
           </w:tcPr>
           <w:p>
-            <w:pPr>
-              <w:jc w:val="left"/>
-            </w:pPr>
-            <w:r/>
-            <w:r>
-              <w:rPr>
-                <w:sz w:val="20"/>
-              </w:rPr>
+            <w:r>
               <w:t>github.com/wilsonchang17/Sherman-CS6204</w:t>
             </w:r>
           </w:p>
@@ -9190,7 +9110,7 @@
                     <pic:cNvPicPr/>
                   </pic:nvPicPr>
                   <pic:blipFill>
-                    <a:blip r:embed="rId20"/>
+                    <a:blip r:embed="rId22"/>
                     <a:stretch>
                       <a:fillRect/>
                     </a:stretch>
@@ -9257,7 +9177,7 @@
                     <pic:cNvPicPr/>
                   </pic:nvPicPr>
                   <pic:blipFill>
-                    <a:blip r:embed="rId21"/>
+                    <a:blip r:embed="rId23"/>
                     <a:stretch>
                       <a:fillRect/>
                     </a:stretch>
@@ -9339,86 +9259,82 @@
       </w:r>
     </w:p>
     <w:p>
-      <w:pPr/>
-      <w:r>
-        <w:t>The final r650 CXL-style setup used sysfs-level hugepage placement rather than numactl --membind=1. The key operational issue was that numactl-based memory binding caused ibv_reg_mr() to fail during RDMA initialization, whereas moving the hugepage pool itself let Sherman allocate remote DRAM transparently.</w:t>
-      </w:r>
-    </w:p>
-    <w:p>
-      <w:pPr/>
+      <w:r>
+        <w:t>The final r650 CXL-style setup used sysfs-level hugepage placement rather than numactl --membind=1. When the Memory Server process was forced onto NUMA node 1 with numactl --membind=1, the CXL-style run failed with a bus error. Separately, incorrect or incompatible memory placement can also surface around RDMA memory registration, such as ibv_reg_mr() failure. Moving the hugepage pool itself let Sherman allocate remote DRAM transparently for the CXL-style experiment.</w:t>
+      </w:r>
+    </w:p>
+    <w:p>
       <w:r>
         <w:rPr>
-          <w:rFonts w:ascii="Courier New" w:hAnsi="Courier New" w:eastAsia="Courier New"/>
+          <w:rFonts w:ascii="Courier New" w:eastAsia="Courier New" w:hAnsi="Courier New"/>
           <w:sz w:val="17"/>
         </w:rPr>
         <w:t>numactl --hardware</w:t>
       </w:r>
     </w:p>
     <w:p>
-      <w:pPr/>
       <w:r>
         <w:rPr>
-          <w:rFonts w:ascii="Courier New" w:hAnsi="Courier New" w:eastAsia="Courier New"/>
+          <w:rFonts w:ascii="Courier New" w:eastAsia="Courier New" w:hAnsi="Courier New"/>
           <w:sz w:val="17"/>
         </w:rPr>
         <w:t>sudo bash -c 'echo 0 &gt; /sys/devices/system/node/node0/hugepages/hugepages-2048kB/nr_hugepages'</w:t>
       </w:r>
     </w:p>
     <w:p>
-      <w:pPr/>
       <w:r>
         <w:rPr>
-          <w:rFonts w:ascii="Courier New" w:hAnsi="Courier New" w:eastAsia="Courier New"/>
+          <w:rFonts w:ascii="Courier New" w:eastAsia="Courier New" w:hAnsi="Courier New"/>
           <w:sz w:val="17"/>
         </w:rPr>
         <w:t>sudo bash -c 'echo 5120 &gt; /sys/devices/system/node/node1/hugepages/hugepages-2048kB/nr_hugepages'</w:t>
       </w:r>
     </w:p>
     <w:p>
-      <w:pPr/>
       <w:r>
         <w:rPr>
-          <w:rFonts w:ascii="Courier New" w:hAnsi="Courier New" w:eastAsia="Courier New"/>
+          <w:rFonts w:ascii="Courier New" w:eastAsia="Courier New" w:hAnsi="Courier New"/>
           <w:sz w:val="17"/>
         </w:rPr>
         <w:t>cat /sys/devices/system/node/node0/hugepages/hugepages-2048kB/nr_hugepages  # expected: 0</w:t>
       </w:r>
     </w:p>
     <w:p>
-      <w:pPr/>
       <w:r>
         <w:rPr>
-          <w:rFonts w:ascii="Courier New" w:hAnsi="Courier New" w:eastAsia="Courier New"/>
+          <w:rFonts w:ascii="Courier New" w:eastAsia="Courier New" w:hAnsi="Courier New"/>
           <w:sz w:val="17"/>
         </w:rPr>
         <w:t>cat /sys/devices/system/node/node1/hugepages/hugepages-2048kB/nr_hugepages  # expected: 5120</w:t>
       </w:r>
     </w:p>
     <w:p>
-      <w:pPr/>
       <w:r>
         <w:t>The verification output showed node0 hugepages set to 0 and node1 hugepages set to 5120, confirming that the Memory Server's 2MB hugepages were allocated on the remote NUMA node used for the emulation.</w:t>
       </w:r>
     </w:p>
     <w:p>
-      <w:pPr/>
-      <w:r>
+      <w:r>
+        <w:rPr>
+          <w:noProof/>
+        </w:rPr>
         <w:drawing>
-          <wp:inline xmlns:a="http://schemas.openxmlformats.org/drawingml/2006/main" xmlns:pic="http://schemas.openxmlformats.org/drawingml/2006/picture">
+          <wp:inline distT="0" distB="0" distL="0" distR="0" wp14:anchorId="50EDF118" wp14:editId="5347004E">
             <wp:extent cx="6126480" cy="2476388"/>
+            <wp:effectExtent l="0" t="0" r="0" b="0"/>
             <wp:docPr id="1261574678" name="Picture 1261574678"/>
             <wp:cNvGraphicFramePr>
-              <a:graphicFrameLocks noChangeAspect="1"/>
+              <a:graphicFrameLocks xmlns:a="http://schemas.openxmlformats.org/drawingml/2006/main" noChangeAspect="1"/>
             </wp:cNvGraphicFramePr>
-            <a:graphic>
+            <a:graphic xmlns:a="http://schemas.openxmlformats.org/drawingml/2006/main">
               <a:graphicData uri="http://schemas.openxmlformats.org/drawingml/2006/picture">
-                <pic:pic>
+                <pic:pic xmlns:pic="http://schemas.openxmlformats.org/drawingml/2006/picture">
                   <pic:nvPicPr>
                     <pic:cNvPr id="0" name="figA3_r650_hugepage_numa_placement.png"/>
                     <pic:cNvPicPr/>
                   </pic:nvPicPr>
                   <pic:blipFill>
-                    <a:blip r:embed="rId25"/>
+                    <a:blip r:embed="rId24"/>
                     <a:stretch>
                       <a:fillRect/>
                     </a:stretch>
@@ -9428,7 +9344,9 @@
                       <a:off x="0" y="0"/>
                       <a:ext cx="6126480" cy="2476388"/>
                     </a:xfrm>
-                    <a:prstGeom prst="rect"/>
+                    <a:prstGeom prst="rect">
+                      <a:avLst/>
+                    </a:prstGeom>
                   </pic:spPr>
                 </pic:pic>
               </a:graphicData>
@@ -9438,7 +9356,6 @@
       </w:r>
     </w:p>
     <w:p>
-      <w:pPr/>
       <w:r>
         <w:rPr>
           <w:i/>
@@ -9457,7 +9374,7 @@
     <w:p/>
     <w:p/>
     <w:sectPr>
-      <w:footerReference w:type="default" r:id="rId22"/>
+      <w:footerReference w:type="default" r:id="rId25"/>
       <w:pgSz w:w="12240" w:h="15840"/>
       <w:pgMar w:top="1440" w:right="1440" w:bottom="1440" w:left="1440" w:header="708" w:footer="708" w:gutter="0"/>
       <w:cols w:space="720"/>
@@ -10102,7 +10019,6 @@
   <w:style w:type="character" w:default="1" w:styleId="DefaultParagraphFont">
     <w:name w:val="Default Paragraph Font"/>
     <w:uiPriority w:val="1"/>
-    <w:semiHidden/>
     <w:unhideWhenUsed/>
   </w:style>
   <w:style w:type="table" w:default="1" w:styleId="TableNormal">

</xml_diff>

<commit_message>
Refine report conclusion wording
</commit_message>
<xml_diff>
--- a/sherman_report.docx
+++ b/sherman_report.docx
@@ -29,7 +29,27 @@
           <w:sz w:val="24"/>
           <w:szCs w:val="24"/>
         </w:rPr>
-        <w:t>Sherman: A Write-Optimized Distributed B+Tree Index on Disaggregated Memory</w:t>
+        <w:t xml:space="preserve">Sherman: A Write-Optimized Distributed </w:t>
+      </w:r>
+      <w:proofErr w:type="spellStart"/>
+      <w:r>
+        <w:rPr>
+          <w:i/>
+          <w:iCs/>
+          <w:sz w:val="24"/>
+          <w:szCs w:val="24"/>
+        </w:rPr>
+        <w:t>B+Tree</w:t>
+      </w:r>
+      <w:proofErr w:type="spellEnd"/>
+      <w:r>
+        <w:rPr>
+          <w:i/>
+          <w:iCs/>
+          <w:sz w:val="24"/>
+          <w:szCs w:val="24"/>
+        </w:rPr>
+        <w:t xml:space="preserve"> Index on Disaggregated Memory</w:t>
       </w:r>
     </w:p>
     <w:p>
@@ -54,18 +74,21 @@
     </w:p>
     <w:p>
       <w:r>
-        <w:t xml:space="preserve">This report begins with a reproduction attempt for Sherman's main performance experiments on c6525-100g CloudLab nodes and then explains why the study had to pivot to r650 for the later stages. On c6525-100g, throughput still increased with read ratio, but we did not observe the uniform/skewed separation shown in the paper. When we later tried to extend the study with CXL-style remote-memory emulation, we found that c6525-100g is single-socket and therefore cannot expose a remote NUMA node. That constraint motivated a move to dual-socket r650 nodes. The r650 follow-up then served two purposes: it enabled the remote-memory experiment and it created a cross-platform comparison with c6525-100g, including a larger HOCL lock table (16,384 versus 8,192 entries). </w:t>
-      </w:r>
-    </w:p>
-    <w:p>
-      <w:r>
-        <w:t xml:space="preserve">Across both platforms, the missing uniform/skewed separation remained. </w:t>
-      </w:r>
-      <w:r>
-        <w:t>The initial r650 NUMA-based CXL emulation measured about a 99.9% index-cache hit rate. Most skewed workloads showed little measurable difference from the baseline, while the uniform write-only run showed an anomalous improvement that is more likely due to run-to-run variance than a real CXL benefit</w:t>
-      </w:r>
-      <w:r>
-        <w:t>. A later cache-size sensitivity run reduced kIndexCacheSize from 1000 MB to 4 MB after a 64 MB trial still produced near-99% hit rates. With 4 MB, the in-run cache hit rates dropped to roughly 32-65% and latency increased, but the hit rates were still rising after 150 seconds, so those numbers should be interpreted as non-steady-state sensitivity evidence rather than final stable performance.</w:t>
+        <w:t xml:space="preserve">This report reproduces Sherman's main performance experiments on c6525-100g </w:t>
+      </w:r>
+      <w:proofErr w:type="spellStart"/>
+      <w:r>
+        <w:t>CloudLab</w:t>
+      </w:r>
+      <w:proofErr w:type="spellEnd"/>
+      <w:r>
+        <w:t xml:space="preserve"> nodes and then extends the study on r650 nodes for dual-socket remote-memory emulation. On c6525-100g, throughput increased with read ratio as expected, but the uniform/skewed separation reported in the paper did not appear. Because c6525-100g is single-socket and cannot expose a remote NUMA node, the later CXL-style experiment was moved to dual-socket r650 nodes.</w:t>
+      </w:r>
+    </w:p>
+    <w:p/>
+    <w:p>
+      <w:r>
+        <w:t>The r650 follow-up confirmed that the missing uniform/skewed separation persisted across platforms. The initial NUMA-based CXL emulation showed very high index-cache hit rates, so most remote-memory effects were hidden by the cache. One uniform write-only result improved anomalously, but this is more likely due to run-to-run variance than a real CXL benefit. A later cache-size sensitivity run showed that reducing the index cache made latency more sensitive to remote memory, although the results were still non-steady-state and should not be treated as final stable performance.</w:t>
       </w:r>
     </w:p>
     <w:p>
@@ -78,13 +101,18 @@
     </w:p>
     <w:p>
       <w:r>
-        <w:t xml:space="preserve">Sherman is a write-optimized distributed B+Tree index designed for disaggregated memory. Its main idea is </w:t>
-      </w:r>
-      <w:r>
-        <w:t>Hierarchical On-Chip Lock</w:t>
-      </w:r>
-      <w:r>
-        <w:t xml:space="preserve"> </w:t>
+        <w:t xml:space="preserve">Sherman is a write-optimized distributed </w:t>
+      </w:r>
+      <w:proofErr w:type="spellStart"/>
+      <w:r>
+        <w:t>B+Tree</w:t>
+      </w:r>
+      <w:proofErr w:type="spellEnd"/>
+      <w:r>
+        <w:t xml:space="preserve"> index designed for disaggregated memory. Its main idea is </w:t>
+      </w:r>
+      <w:r>
+        <w:t xml:space="preserve">Hierarchical On-Chip Lock </w:t>
       </w:r>
       <w:r>
         <w:t>(HOCL), which use the on-chip SRAM of RDMA NICs as a lock table and thereby reduce remote RDMA round-trips during lock acquisition. In the paper, this design yields 24.7x higher throughput on write-only workloads and 23.6x higher throughput on write-intensive skewed workloads relative to FG+.</w:t>
@@ -93,9 +121,20 @@
     <w:p/>
     <w:p>
       <w:r>
-        <w:t>This report has a two-stage goal structure. First, it reproduces Sherman's main experiments for Figures 10 and 11 as closely as CloudLab allows on c6525-100g. Second, after c6525-100g proved unable to support CXL-style emulation because it is single-socket, it pivots to r650 to continue the study on a dual-socket platform. That second stage is not only about remote-memory sensitivity; it also provides a direct cross-platform comparison with c6525-100g, letting us ask whether the behavior seen in the initial reproduction persists after the platform changes.</w:t>
-      </w:r>
-    </w:p>
+        <w:t xml:space="preserve">This report has a two-stage goal structure. First, it reproduces Sherman's main experiments for Figures 10 and 11 as closely as </w:t>
+      </w:r>
+      <w:proofErr w:type="spellStart"/>
+      <w:r>
+        <w:t>CloudLab</w:t>
+      </w:r>
+      <w:proofErr w:type="spellEnd"/>
+      <w:r>
+        <w:t xml:space="preserve"> allows on c6525-100g. Second, after c6525-100g proved unable to support CXL-style emulation because it is single-socket, it pivots to r650 to continue the study on a dual-socket platform. That second stage is not only about remote-memory sensitivity; it also provides a direct cross-platform comparison with c6525-100g, letting us ask whether the behavior seen in the initial reproduction persists after the platform changes.</w:t>
+      </w:r>
+    </w:p>
+    <w:p/>
+    <w:p/>
+    <w:p/>
     <w:p/>
     <w:p>
       <w:pPr>
@@ -116,10 +155,21 @@
       <w:r>
         <w:t>2.1 Hardware, Software, and Workload Comparison</w:t>
       </w:r>
-    </w:p>
-    <w:p>
-      <w:r>
-        <w:t>We used a reduced two-physical-node CloudLab deployment, with one Memory Server role and one Compute Server role per node. In contrast, the Sherman paper used 8 physical servers and emulated one MS and one CS on each server, giving 8 MSs + 8 CSs as logical roles and 176 total client threads. The study started on c6525-100g machines in the Utah cluster, where we collected the main reproduction results. Later, when the project turned to CXL-style remote-memory emulation, we moved that follow-up stage to r650 machines in the Clemson cluster because only the dual-socket r650 exposes a remote NUMA node.</w:t>
+      <w:r>
+        <w:t xml:space="preserve"> </w:t>
+      </w:r>
+    </w:p>
+    <w:p>
+      <w:r>
+        <w:t xml:space="preserve">We used a reduced two-physical-node </w:t>
+      </w:r>
+      <w:proofErr w:type="spellStart"/>
+      <w:r>
+        <w:t>CloudLab</w:t>
+      </w:r>
+      <w:proofErr w:type="spellEnd"/>
+      <w:r>
+        <w:t xml:space="preserve"> deployment, with one Memory Server role and one Compute Server role per node. In contrast, the Sherman paper used 8 physical servers and emulated one MS and one CS on each server, giving 8 MSs + 8 CSs as logical roles and 176 total client threads. The study started on c6525-100g machines in the Utah cluster, where we collected the main reproduction results. Later, when the project turned to CXL-style remote-memory emulation, we moved that follow-up stage to r650 machines in the Clemson cluster because only the dual-socket r650 exposes a remote NUMA node.</w:t>
       </w:r>
     </w:p>
     <w:p/>
@@ -138,12 +188,28 @@
     </w:p>
     <w:p>
       <w:r>
-        <w:t>Table 1 separates physical server count from MS/CS logical roles, then compares the paper's Section 5.1 setup with the two platforms used in this report. c6525-100g is the initial reproduction platform. r650 becomes the dual-socket follow-up platform after the CXL implementation, and that move also creates a useful cross-platform comparison for interpreting the c6525-100g results.</w:t>
-      </w:r>
-    </w:p>
-    <w:p>
-      <w:r>
-        <w:t>The workload structure still follows Figures 10 and 11 in the paper: uniform (zipfian=0) and skewed (zipfian=0.99) access patterns, each tested at 0%, 50%, and 95% reads. However, our runs used 44 total threads rather than the paper's 176, so absolute throughput should be read as a reduced-scale reproduction rather than a direct paper-scale comparison.</w:t>
+        <w:t>Table 1 separates physical server count from MS/CS logical roles, then compares the paper's setup with the two platforms used in this report. c6525-100g is the initial reproduction platform. r650 becomes the dual-socket follow-up platform after the CXL implementation, and that move also creates a useful cross-platform comparison for interpreting the c6525-100g results.</w:t>
+      </w:r>
+    </w:p>
+    <w:p>
+      <w:r>
+        <w:t>The workload structure still follows Figures 10 and 11 in the paper: uniform (</w:t>
+      </w:r>
+      <w:proofErr w:type="spellStart"/>
+      <w:r>
+        <w:t>zipfian</w:t>
+      </w:r>
+      <w:proofErr w:type="spellEnd"/>
+      <w:r>
+        <w:t>=0) and skewed (</w:t>
+      </w:r>
+      <w:proofErr w:type="spellStart"/>
+      <w:r>
+        <w:t>zipfian</w:t>
+      </w:r>
+      <w:proofErr w:type="spellEnd"/>
+      <w:r>
+        <w:t>=0.99) access patterns, each tested at 0%, 50%, and 95% reads. However, our runs used 44 total threads rather than the paper's 176, so absolute throughput should be read as a reduced-scale reproduction rather than a direct paper-scale comparison.</w:t>
       </w:r>
     </w:p>
     <w:p/>
@@ -1084,126 +1150,547 @@
     <w:p>
       <w:pPr>
         <w:pStyle w:val="Heading1"/>
+        <w:rPr>
+          <w:bCs w:val="0"/>
+        </w:rPr>
       </w:pPr>
       <w:r>
         <w:rPr>
+          <w:bCs w:val="0"/>
+        </w:rPr>
+        <w:t>3. Environment Issues That Affected Benchmark Correctness and Stability</w:t>
+      </w:r>
+    </w:p>
+    <w:p>
+      <w:r>
+        <w:t xml:space="preserve">Before we could collect benchmark data, we had to resolve several environment problems that affected correctness, network-path selection, run stability, or the interpretation of the extended CXL-style experiment. </w:t>
+      </w:r>
+      <w:r>
+        <w:rPr>
+          <w:b/>
+          <w:bCs/>
+          <w:color w:val="EE0000"/>
+        </w:rPr>
+        <w:t>Appendix A</w:t>
+      </w:r>
+      <w:r>
+        <w:rPr>
+          <w:color w:val="EE0000"/>
+        </w:rPr>
+        <w:t xml:space="preserve"> </w:t>
+      </w:r>
+      <w:r>
+        <w:t>keeps the command-level details; here we retain only the issues needed to understand the reported results.</w:t>
+      </w:r>
+    </w:p>
+    <w:p>
+      <w:pPr>
+        <w:pStyle w:val="Heading2"/>
+        <w:rPr>
+          <w:sz w:val="24"/>
+          <w:szCs w:val="24"/>
+        </w:rPr>
+      </w:pPr>
+      <w:r>
+        <w:rPr>
+          <w:sz w:val="24"/>
+          <w:szCs w:val="24"/>
+        </w:rPr>
+        <w:t>3.1 MLNX_OFED Library Version Conflict</w:t>
+      </w:r>
+    </w:p>
+    <w:p>
+      <w:r>
+        <w:t xml:space="preserve">Sherman depends on the </w:t>
+      </w:r>
+      <w:proofErr w:type="spellStart"/>
+      <w:r>
+        <w:t>ibv_exp</w:t>
+      </w:r>
+      <w:proofErr w:type="spellEnd"/>
+      <w:r>
+        <w:t xml:space="preserve">_* experimental API (MLNX_LIBS version 41mlnx1), whereas the default MLNX_OFED installation provides UPSTREAM_LIBS (version 50mlnx1), which lacks that API and conflicts with Ubuntu's </w:t>
+      </w:r>
+      <w:proofErr w:type="spellStart"/>
+      <w:r>
+        <w:t>ibverbs</w:t>
+      </w:r>
+      <w:proofErr w:type="spellEnd"/>
+      <w:r>
+        <w:t xml:space="preserve">-providers package. We switched to the MLNX_LIBS </w:t>
+      </w:r>
+      <w:proofErr w:type="spellStart"/>
+      <w:r>
+        <w:t>libibverbs</w:t>
+      </w:r>
+      <w:proofErr w:type="spellEnd"/>
+      <w:r>
+        <w:t xml:space="preserve"> path required by Sherman.</w:t>
+      </w:r>
+    </w:p>
+    <w:p>
+      <w:pPr>
+        <w:pStyle w:val="Heading2"/>
+        <w:rPr>
+          <w:sz w:val="24"/>
+          <w:szCs w:val="24"/>
+        </w:rPr>
+      </w:pPr>
+      <w:r>
+        <w:rPr>
+          <w:sz w:val="24"/>
+          <w:szCs w:val="24"/>
+        </w:rPr>
+        <w:t>3.2 On-Chip Memory Size Detection</w:t>
+      </w:r>
+    </w:p>
+    <w:p>
+      <w:r>
+        <w:t xml:space="preserve">The original code hardcodes </w:t>
+      </w:r>
+      <w:proofErr w:type="spellStart"/>
+      <w:r>
+        <w:t>kLockChipMemSize</w:t>
+      </w:r>
+      <w:proofErr w:type="spellEnd"/>
+      <w:r>
+        <w:t xml:space="preserve"> = 256 * 1024, but </w:t>
+      </w:r>
+      <w:proofErr w:type="spellStart"/>
+      <w:r>
+        <w:t>ibv_exp_alloc_dm</w:t>
+      </w:r>
+      <w:proofErr w:type="spellEnd"/>
+      <w:r>
+        <w:t xml:space="preserve">() could allocate only 64KB on c6525-100g and 128KB on r650. To handle this, setup.sh probes the actual allocatable limit and patches </w:t>
+      </w:r>
+      <w:proofErr w:type="spellStart"/>
+      <w:r>
+        <w:t>kLockChipMemSize</w:t>
+      </w:r>
+      <w:proofErr w:type="spellEnd"/>
+      <w:r>
+        <w:t xml:space="preserve"> automatically. Combined with the open-source repository's uint64_t lock entries, this leaves 8,192 lock entries on c6525-100g and 16,384 on r650.</w:t>
+      </w:r>
+    </w:p>
+    <w:p>
+      <w:pPr>
+        <w:pStyle w:val="Heading2"/>
+        <w:rPr>
+          <w:sz w:val="24"/>
+          <w:szCs w:val="24"/>
+        </w:rPr>
+      </w:pPr>
+      <w:r>
+        <w:rPr>
+          <w:sz w:val="24"/>
+          <w:szCs w:val="24"/>
+        </w:rPr>
+        <w:lastRenderedPageBreak/>
+        <w:t>3.3 RDMA Network Interface Selection</w:t>
+      </w:r>
+    </w:p>
+    <w:p>
+      <w:r>
+        <w:t xml:space="preserve">On every node type we used, mlx5_2 maps to the 100Gbps experiment network. However, </w:t>
+      </w:r>
+      <w:proofErr w:type="spellStart"/>
+      <w:r>
+        <w:t>src</w:t>
+      </w:r>
+      <w:proofErr w:type="spellEnd"/>
+      <w:r>
+        <w:t>/</w:t>
+      </w:r>
+      <w:proofErr w:type="spellStart"/>
+      <w:r>
+        <w:t>rdma</w:t>
+      </w:r>
+      <w:proofErr w:type="spellEnd"/>
+      <w:r>
+        <w:t>/Resource.cpp selects the first device whose name ends in '0', which defaults to the control network. We patched the selection logic to use the device ending in '2' and confirmed the traffic path with mlx5 port counters.</w:t>
+      </w:r>
+    </w:p>
+    <w:p>
+      <w:pPr>
+        <w:pStyle w:val="Heading2"/>
+        <w:rPr>
+          <w:sz w:val="24"/>
+          <w:szCs w:val="24"/>
+        </w:rPr>
+      </w:pPr>
+      <w:r>
+        <w:rPr>
+          <w:sz w:val="24"/>
+          <w:szCs w:val="24"/>
+        </w:rPr>
+        <w:t xml:space="preserve">3.4 </w:t>
+      </w:r>
+      <w:proofErr w:type="spellStart"/>
+      <w:r>
+        <w:rPr>
+          <w:sz w:val="24"/>
+          <w:szCs w:val="24"/>
+        </w:rPr>
+        <w:t>memcached</w:t>
+      </w:r>
+      <w:proofErr w:type="spellEnd"/>
+      <w:r>
+        <w:rPr>
+          <w:sz w:val="24"/>
+          <w:szCs w:val="24"/>
+        </w:rPr>
+        <w:t xml:space="preserve"> Coordination State</w:t>
+      </w:r>
+    </w:p>
+    <w:p>
+      <w:r>
+        <w:t xml:space="preserve">Sherman uses </w:t>
+      </w:r>
+      <w:proofErr w:type="spellStart"/>
+      <w:r>
+        <w:t>memcached_increment</w:t>
+      </w:r>
+      <w:proofErr w:type="spellEnd"/>
+      <w:r>
+        <w:t xml:space="preserve"> on the key </w:t>
+      </w:r>
+      <w:proofErr w:type="spellStart"/>
+      <w:r>
+        <w:t>serverNum</w:t>
+      </w:r>
+      <w:proofErr w:type="spellEnd"/>
+      <w:r>
+        <w:t xml:space="preserve"> to assign node IDs. If that key is missing, the benchmark hangs. After each run, stale QP connection keys can also prevent the next run's Queue Pairs from reaching Ready-to-Send (RTS) state. We therefore initialized </w:t>
+      </w:r>
+      <w:proofErr w:type="spellStart"/>
+      <w:r>
+        <w:t>serverNum</w:t>
+      </w:r>
+      <w:proofErr w:type="spellEnd"/>
+      <w:r>
+        <w:t xml:space="preserve"> before each run and cleared stale coordination state between runs.</w:t>
+      </w:r>
+    </w:p>
+    <w:p>
+      <w:pPr>
+        <w:pStyle w:val="Heading2"/>
+        <w:rPr>
+          <w:sz w:val="24"/>
+          <w:szCs w:val="24"/>
+        </w:rPr>
+      </w:pPr>
+      <w:r>
+        <w:rPr>
+          <w:sz w:val="24"/>
+          <w:szCs w:val="24"/>
+        </w:rPr>
+        <w:t>3.5 Execution Controls</w:t>
+      </w:r>
+    </w:p>
+    <w:p>
+      <w:r>
+        <w:t xml:space="preserve">Running setup.sh with </w:t>
+      </w:r>
+      <w:proofErr w:type="spellStart"/>
+      <w:r>
+        <w:t>sudo</w:t>
+      </w:r>
+      <w:proofErr w:type="spellEnd"/>
+      <w:r>
+        <w:t xml:space="preserve"> can leave build artifacts owned by root, which blocks later rebuilds until ownership is fixed. The benchmark also inserts about 50 million key-value pairs before measurement; on both platforms, warmup took about 17-18 seconds, so we used a 150-second total timeout.</w:t>
+      </w:r>
+    </w:p>
+    <w:p>
+      <w:pPr>
+        <w:pStyle w:val="Heading2"/>
+        <w:rPr>
+          <w:sz w:val="24"/>
+          <w:szCs w:val="24"/>
+        </w:rPr>
+      </w:pPr>
+      <w:r>
+        <w:rPr>
+          <w:sz w:val="24"/>
+          <w:szCs w:val="24"/>
+        </w:rPr>
+        <w:t xml:space="preserve">3.6 Cross-NUMA </w:t>
+      </w:r>
+      <w:proofErr w:type="spellStart"/>
+      <w:r>
+        <w:rPr>
+          <w:sz w:val="24"/>
+          <w:szCs w:val="24"/>
+        </w:rPr>
+        <w:t>Hugepage</w:t>
+      </w:r>
+      <w:proofErr w:type="spellEnd"/>
+      <w:r>
+        <w:rPr>
+          <w:sz w:val="24"/>
+          <w:szCs w:val="24"/>
+        </w:rPr>
+        <w:t xml:space="preserve"> Migration for CXL Emulation</w:t>
+      </w:r>
+    </w:p>
+    <w:p>
+      <w:pPr>
+        <w:pStyle w:val="Heading2"/>
+        <w:rPr>
           <w:b w:val="0"/>
-        </w:rPr>
-        <w:t>3. Environment Issues That Affected Benchmark Correctness and Stability</w:t>
-      </w:r>
-    </w:p>
-    <w:p>
-      <w:r>
-        <w:t>Before we could collect benchmark data, we had to resolve several environment problems that affected correctness, network-path selection, run stability, or the interpretation of the extended CXL-style experiment. Appendix A keeps the command-level details; here we retain only the issues needed to understand the reported results.</w:t>
-      </w:r>
-    </w:p>
+          <w:bCs w:val="0"/>
+          <w:color w:val="auto"/>
+          <w:sz w:val="22"/>
+          <w:szCs w:val="22"/>
+        </w:rPr>
+      </w:pPr>
+      <w:r>
+        <w:rPr>
+          <w:b w:val="0"/>
+          <w:bCs w:val="0"/>
+          <w:color w:val="auto"/>
+          <w:sz w:val="22"/>
+          <w:szCs w:val="22"/>
+        </w:rPr>
+        <w:t xml:space="preserve">For the r650 CXL-style experiment, process-level NUMA binding was not sufficient. When we tried to force the Memory Server process onto NUMA node 1 with </w:t>
+      </w:r>
+      <w:proofErr w:type="spellStart"/>
+      <w:r>
+        <w:rPr>
+          <w:b w:val="0"/>
+          <w:bCs w:val="0"/>
+          <w:color w:val="auto"/>
+          <w:sz w:val="22"/>
+          <w:szCs w:val="22"/>
+        </w:rPr>
+        <w:t>numactl</w:t>
+      </w:r>
+      <w:proofErr w:type="spellEnd"/>
+      <w:r>
+        <w:rPr>
+          <w:b w:val="0"/>
+          <w:bCs w:val="0"/>
+          <w:color w:val="auto"/>
+          <w:sz w:val="22"/>
+          <w:szCs w:val="22"/>
+        </w:rPr>
+        <w:t xml:space="preserve"> --</w:t>
+      </w:r>
+      <w:proofErr w:type="spellStart"/>
+      <w:r>
+        <w:rPr>
+          <w:b w:val="0"/>
+          <w:bCs w:val="0"/>
+          <w:color w:val="auto"/>
+          <w:sz w:val="22"/>
+          <w:szCs w:val="22"/>
+        </w:rPr>
+        <w:t>membind</w:t>
+      </w:r>
+      <w:proofErr w:type="spellEnd"/>
+      <w:r>
+        <w:rPr>
+          <w:b w:val="0"/>
+          <w:bCs w:val="0"/>
+          <w:color w:val="auto"/>
+          <w:sz w:val="22"/>
+          <w:szCs w:val="22"/>
+        </w:rPr>
+        <w:t xml:space="preserve">=1, the run failed with a bus error. The practical workaround was to control </w:t>
+      </w:r>
+      <w:proofErr w:type="spellStart"/>
+      <w:r>
+        <w:rPr>
+          <w:b w:val="0"/>
+          <w:bCs w:val="0"/>
+          <w:color w:val="auto"/>
+          <w:sz w:val="22"/>
+          <w:szCs w:val="22"/>
+        </w:rPr>
+        <w:t>hugepage</w:t>
+      </w:r>
+      <w:proofErr w:type="spellEnd"/>
+      <w:r>
+        <w:rPr>
+          <w:b w:val="0"/>
+          <w:bCs w:val="0"/>
+          <w:color w:val="auto"/>
+          <w:sz w:val="22"/>
+          <w:szCs w:val="22"/>
+        </w:rPr>
+        <w:t xml:space="preserve"> placement directly through </w:t>
+      </w:r>
+      <w:proofErr w:type="spellStart"/>
+      <w:r>
+        <w:rPr>
+          <w:b w:val="0"/>
+          <w:bCs w:val="0"/>
+          <w:color w:val="auto"/>
+          <w:sz w:val="22"/>
+          <w:szCs w:val="22"/>
+        </w:rPr>
+        <w:t>sysfs</w:t>
+      </w:r>
+      <w:proofErr w:type="spellEnd"/>
+      <w:r>
+        <w:rPr>
+          <w:b w:val="0"/>
+          <w:bCs w:val="0"/>
+          <w:color w:val="auto"/>
+          <w:sz w:val="22"/>
+          <w:szCs w:val="22"/>
+        </w:rPr>
+        <w:t xml:space="preserve">: we cleared the 2MB </w:t>
+      </w:r>
+      <w:proofErr w:type="spellStart"/>
+      <w:r>
+        <w:rPr>
+          <w:b w:val="0"/>
+          <w:bCs w:val="0"/>
+          <w:color w:val="auto"/>
+          <w:sz w:val="22"/>
+          <w:szCs w:val="22"/>
+        </w:rPr>
+        <w:t>hugepage</w:t>
+      </w:r>
+      <w:proofErr w:type="spellEnd"/>
+      <w:r>
+        <w:rPr>
+          <w:b w:val="0"/>
+          <w:bCs w:val="0"/>
+          <w:color w:val="auto"/>
+          <w:sz w:val="22"/>
+          <w:szCs w:val="22"/>
+        </w:rPr>
+        <w:t xml:space="preserve"> pool on NUMA node 0, allocated 5120 2MB </w:t>
+      </w:r>
+      <w:proofErr w:type="spellStart"/>
+      <w:r>
+        <w:rPr>
+          <w:b w:val="0"/>
+          <w:bCs w:val="0"/>
+          <w:color w:val="auto"/>
+          <w:sz w:val="22"/>
+          <w:szCs w:val="22"/>
+        </w:rPr>
+        <w:t>hugepages</w:t>
+      </w:r>
+      <w:proofErr w:type="spellEnd"/>
+      <w:r>
+        <w:rPr>
+          <w:b w:val="0"/>
+          <w:bCs w:val="0"/>
+          <w:color w:val="auto"/>
+          <w:sz w:val="22"/>
+          <w:szCs w:val="22"/>
+        </w:rPr>
+        <w:t xml:space="preserve"> on NUMA node 1, and then launched Sherman normally. Because the NIC PCIe path remains attached to node 0 while the Memory Server's </w:t>
+      </w:r>
+      <w:proofErr w:type="spellStart"/>
+      <w:r>
+        <w:rPr>
+          <w:b w:val="0"/>
+          <w:bCs w:val="0"/>
+          <w:color w:val="auto"/>
+          <w:sz w:val="22"/>
+          <w:szCs w:val="22"/>
+        </w:rPr>
+        <w:t>hugepages</w:t>
+      </w:r>
+      <w:proofErr w:type="spellEnd"/>
+      <w:r>
+        <w:rPr>
+          <w:b w:val="0"/>
+          <w:bCs w:val="0"/>
+          <w:color w:val="auto"/>
+          <w:sz w:val="22"/>
+          <w:szCs w:val="22"/>
+        </w:rPr>
+        <w:t xml:space="preserve"> come from node 1, Sherman uses remote DRAM without requiring code changes.</w:t>
+      </w:r>
+    </w:p>
+    <w:p>
+      <w:pPr>
+        <w:pStyle w:val="Heading2"/>
+        <w:rPr>
+          <w:b w:val="0"/>
+          <w:bCs w:val="0"/>
+          <w:color w:val="auto"/>
+          <w:sz w:val="22"/>
+          <w:szCs w:val="22"/>
+        </w:rPr>
+      </w:pPr>
+      <w:r>
+        <w:t>4. Reproduction Results and Comparison with the Paper (c6525-100g, Utah Cluster)</w:t>
+      </w:r>
+    </w:p>
+    <w:p>
+      <w:r>
+        <w:t>This section presents our reproduction of the paper's original results on c6525-100g. All benchmarks used mlx5_2 (ens1f0, 10.10.1.x, 100Gbps). Our deployment uses 44 total threads, whereas the paper uses 176, so absolute throughput should be compared with that scale difference in mind.</w:t>
+      </w:r>
+    </w:p>
+    <w:p/>
     <w:p>
       <w:pPr>
         <w:pStyle w:val="Heading2"/>
       </w:pPr>
       <w:r>
-        <w:t>3.1 MLNX_OFED Library Version Conflict</w:t>
-      </w:r>
-    </w:p>
-    <w:p>
-      <w:r>
-        <w:t>Sherman depends on the ibv_exp_* experimental API (MLNX_LIBS version 41mlnx1), whereas the default MLNX_OFED installation provides UPSTREAM_LIBS (version 50mlnx1), which lacks that API and conflicts with Ubuntu's ibverbs-providers package. We therefore switched to the MLNX_LIBS libibverbs path required by Sherman.</w:t>
+        <w:t>4.1 Uniform Workloads (Figure 11)</w:t>
+      </w:r>
+    </w:p>
+    <w:p>
+      <w:r>
+        <w:t xml:space="preserve">Workload: </w:t>
+      </w:r>
+      <w:proofErr w:type="spellStart"/>
+      <w:r>
+        <w:t>zipfian</w:t>
+      </w:r>
+      <w:proofErr w:type="spellEnd"/>
+      <w:r>
+        <w:t>=0, 22 compute threads per node (44 total).</w:t>
       </w:r>
     </w:p>
     <w:p>
       <w:pPr>
-        <w:pStyle w:val="Heading2"/>
+        <w:spacing w:before="60" w:after="160" w:line="240" w:lineRule="auto"/>
+        <w:jc w:val="center"/>
+        <w:rPr>
+          <w:i/>
+          <w:sz w:val="20"/>
+        </w:rPr>
       </w:pPr>
-      <w:r>
-        <w:t>3.2 On-Chip Memory Size Detection</w:t>
-      </w:r>
-    </w:p>
-    <w:p>
-      <w:r>
-        <w:t>The original code hardcodes kLockChipMemSize = 256 * 1024, but ibv_exp_alloc_dm() could allocate only 64KB on c6525-100g and 128KB on r650. To handle this, setup.sh probes the actual allocatable limit and patches kLockChipMemSize automatically. Combined with the open-source repository's uint64_t lock entries, this leaves 8,192 lock entries on c6525-100g and 16,384 on r650.</w:t>
-      </w:r>
     </w:p>
     <w:p>
       <w:pPr>
-        <w:pStyle w:val="Heading2"/>
+        <w:spacing w:before="60" w:after="160" w:line="240" w:lineRule="auto"/>
+        <w:jc w:val="center"/>
+        <w:rPr>
+          <w:i/>
+          <w:sz w:val="20"/>
+        </w:rPr>
       </w:pPr>
-      <w:r>
-        <w:lastRenderedPageBreak/>
-        <w:t>3.3 RDMA Network Interface Selection</w:t>
-      </w:r>
-    </w:p>
-    <w:p>
-      <w:r>
-        <w:t>On every node type we used, mlx5_2 maps to the 100Gbps experiment network. However, src/rdma/Resource.cpp selects the first device whose name ends in '0', which defaults to the control network. We patched the selection logic to use the device ending in '2' and confirmed the traffic path with mlx5 port counters.</w:t>
-      </w:r>
     </w:p>
     <w:p>
       <w:pPr>
-        <w:pStyle w:val="Heading2"/>
+        <w:spacing w:before="60" w:after="160" w:line="240" w:lineRule="auto"/>
+        <w:jc w:val="center"/>
+        <w:rPr>
+          <w:i/>
+          <w:sz w:val="20"/>
+        </w:rPr>
       </w:pPr>
-      <w:r>
-        <w:t>3.4 memcached Coordination State</w:t>
-      </w:r>
-    </w:p>
-    <w:p>
-      <w:r>
-        <w:t>Sherman uses memcached_increment on the key serverNum to assign node IDs. If that key is missing, the benchmark hangs. After each run, stale QP connection keys can also prevent the next run's Queue Pairs from reaching Ready-to-Send (RTS) state. We therefore initialized serverNum before each run and cleared stale coordination state between runs.</w:t>
-      </w:r>
     </w:p>
     <w:p>
       <w:pPr>
-        <w:pStyle w:val="Heading2"/>
+        <w:spacing w:before="60" w:after="160" w:line="240" w:lineRule="auto"/>
+        <w:jc w:val="center"/>
+        <w:rPr>
+          <w:i/>
+          <w:sz w:val="20"/>
+        </w:rPr>
       </w:pPr>
-      <w:r>
-        <w:t>3.5 Execution Controls</w:t>
-      </w:r>
-    </w:p>
-    <w:p>
-      <w:r>
-        <w:t>Running setup.sh with sudo can leave build artifacts owned by root, which blocks later rebuilds until ownership is fixed. The benchmark also inserts about 50 million key-value pairs before measurement; on both platforms, warmup took about 17-18 seconds, so we used a 150-second total timeout.</w:t>
-      </w:r>
-    </w:p>
-    <w:p>
-      <w:pPr>
-        <w:pStyle w:val="Heading2"/>
-      </w:pPr>
-      <w:r>
-        <w:t>3.6 Cross-NUMA Hugepage Migration for CXL Emulation</w:t>
-      </w:r>
-    </w:p>
-    <w:p>
-      <w:r>
-        <w:t>For the r650 CXL-style experiment, process-level NUMA binding was not sufficient. When we tried to force the Memory Server process onto NUMA node 1 with numactl --membind=1, the CXL-style run failed with a bus error. Separately, in the RDMA initialization path, incorrect or incompatible memory placement can also surface around RDMA memory registration, such as ibv_reg_mr() failure. The practical workaround for the CXL-style experiment was therefore to configure hugepage placement directly through sysfs: clear the 2MB hugepage pool on NUMA node 0, allocate 5120 2MB hugepages on NUMA node 1, and then launch Sherman normally. Because the NIC PCIe path remains attached to node 0 while the Memory Server's hugepages come from node 1, Sherman transparently uses remote DRAM without requiring code changes.</w:t>
-      </w:r>
-    </w:p>
-    <w:p>
-      <w:pPr>
-        <w:pStyle w:val="Heading1"/>
-      </w:pPr>
-      <w:r>
-        <w:t>4. Reproduction Results and Comparison with the Paper (c6525-100g, Utah Cluster)</w:t>
-      </w:r>
-    </w:p>
-    <w:p>
-      <w:r>
-        <w:t>This section presents our reproduction of the paper's original results on c6525-100g. All benchmarks used mlx5_2 (ens1f0, 10.10.1.x, 100Gbps). Our deployment uses 44 total threads, whereas the paper uses 176, so absolute throughput should be compared with that scale difference in mind.</w:t>
-      </w:r>
-    </w:p>
-    <w:p/>
-    <w:p>
-      <w:pPr>
-        <w:pStyle w:val="Heading2"/>
-      </w:pPr>
-      <w:r>
-        <w:t>4.1 Uniform Workloads (Figure 11)</w:t>
-      </w:r>
-    </w:p>
-    <w:p>
-      <w:r>
-        <w:t>Workload: zipfian=0, 22 compute threads per node (44 total).</w:t>
-      </w:r>
-    </w:p>
-    <w:p/>
+    </w:p>
     <w:p>
       <w:pPr>
         <w:spacing w:before="60" w:after="160" w:line="240" w:lineRule="auto"/>
@@ -1214,6 +1701,7 @@
           <w:i/>
           <w:sz w:val="20"/>
         </w:rPr>
+        <w:lastRenderedPageBreak/>
         <w:t>Table 2. c6525-100g uniform workloads versus the paper (paper Figure 11 comparison).</w:t>
       </w:r>
     </w:p>
@@ -1268,7 +1756,6 @@
                 <w:sz w:val="20"/>
                 <w:szCs w:val="20"/>
               </w:rPr>
-              <w:lastRenderedPageBreak/>
               <w:t>Workload</w:t>
             </w:r>
           </w:p>
@@ -1317,22 +1804,9 @@
                 <w:sz w:val="20"/>
                 <w:szCs w:val="20"/>
               </w:rPr>
-              <w:t>Our Tput (Mops)</w:t>
-            </w:r>
-          </w:p>
-        </w:tc>
-        <w:tc>
-          <w:tcPr>
-            <w:tcW w:w="1000" w:type="dxa"/>
-            <w:shd w:val="clear" w:color="auto" w:fill="2E75B6"/>
-            <w:tcMar>
-              <w:top w:w="80" w:type="dxa"/>
-              <w:left w:w="120" w:type="dxa"/>
-              <w:bottom w:w="80" w:type="dxa"/>
-              <w:right w:w="120" w:type="dxa"/>
-            </w:tcMar>
-          </w:tcPr>
-          <w:p>
+              <w:t xml:space="preserve">Our </w:t>
+            </w:r>
+            <w:proofErr w:type="spellStart"/>
             <w:r>
               <w:rPr>
                 <w:b/>
@@ -1341,22 +1815,9 @@
                 <w:sz w:val="20"/>
                 <w:szCs w:val="20"/>
               </w:rPr>
-              <w:t>Paper (Mops)</w:t>
-            </w:r>
-          </w:p>
-        </w:tc>
-        <w:tc>
-          <w:tcPr>
-            <w:tcW w:w="1050" w:type="dxa"/>
-            <w:shd w:val="clear" w:color="auto" w:fill="2E75B6"/>
-            <w:tcMar>
-              <w:top w:w="80" w:type="dxa"/>
-              <w:left w:w="120" w:type="dxa"/>
-              <w:bottom w:w="80" w:type="dxa"/>
-              <w:right w:w="120" w:type="dxa"/>
-            </w:tcMar>
-          </w:tcPr>
-          <w:p>
+              <w:t>Tput</w:t>
+            </w:r>
+            <w:proofErr w:type="spellEnd"/>
             <w:r>
               <w:rPr>
                 <w:b/>
@@ -1365,13 +1826,13 @@
                 <w:sz w:val="20"/>
                 <w:szCs w:val="20"/>
               </w:rPr>
-              <w:t>Our p50 (us)</w:t>
-            </w:r>
-          </w:p>
-        </w:tc>
-        <w:tc>
-          <w:tcPr>
-            <w:tcW w:w="1050" w:type="dxa"/>
+              <w:t xml:space="preserve"> (Mops)</w:t>
+            </w:r>
+          </w:p>
+        </w:tc>
+        <w:tc>
+          <w:tcPr>
+            <w:tcW w:w="1000" w:type="dxa"/>
             <w:shd w:val="clear" w:color="auto" w:fill="2E75B6"/>
             <w:tcMar>
               <w:top w:w="80" w:type="dxa"/>
@@ -1389,13 +1850,13 @@
                 <w:sz w:val="20"/>
                 <w:szCs w:val="20"/>
               </w:rPr>
-              <w:t>Paper p50 (us)</w:t>
-            </w:r>
-          </w:p>
-        </w:tc>
-        <w:tc>
-          <w:tcPr>
-            <w:tcW w:w="1000" w:type="dxa"/>
+              <w:t>Paper (Mops)</w:t>
+            </w:r>
+          </w:p>
+        </w:tc>
+        <w:tc>
+          <w:tcPr>
+            <w:tcW w:w="1050" w:type="dxa"/>
             <w:shd w:val="clear" w:color="auto" w:fill="2E75B6"/>
             <w:tcMar>
               <w:top w:w="80" w:type="dxa"/>
@@ -1413,13 +1874,13 @@
                 <w:sz w:val="20"/>
                 <w:szCs w:val="20"/>
               </w:rPr>
-              <w:t>Our p99 (us)</w:t>
-            </w:r>
-          </w:p>
-        </w:tc>
-        <w:tc>
-          <w:tcPr>
-            <w:tcW w:w="1110" w:type="dxa"/>
+              <w:t>Our p50 (us)</w:t>
+            </w:r>
+          </w:p>
+        </w:tc>
+        <w:tc>
+          <w:tcPr>
+            <w:tcW w:w="1050" w:type="dxa"/>
             <w:shd w:val="clear" w:color="auto" w:fill="2E75B6"/>
             <w:tcMar>
               <w:top w:w="80" w:type="dxa"/>
@@ -1437,6 +1898,54 @@
                 <w:sz w:val="20"/>
                 <w:szCs w:val="20"/>
               </w:rPr>
+              <w:t>Paper p50 (us)</w:t>
+            </w:r>
+          </w:p>
+        </w:tc>
+        <w:tc>
+          <w:tcPr>
+            <w:tcW w:w="1000" w:type="dxa"/>
+            <w:shd w:val="clear" w:color="auto" w:fill="2E75B6"/>
+            <w:tcMar>
+              <w:top w:w="80" w:type="dxa"/>
+              <w:left w:w="120" w:type="dxa"/>
+              <w:bottom w:w="80" w:type="dxa"/>
+              <w:right w:w="120" w:type="dxa"/>
+            </w:tcMar>
+          </w:tcPr>
+          <w:p>
+            <w:r>
+              <w:rPr>
+                <w:b/>
+                <w:bCs/>
+                <w:color w:val="FFFFFF"/>
+                <w:sz w:val="20"/>
+                <w:szCs w:val="20"/>
+              </w:rPr>
+              <w:t>Our p99 (us)</w:t>
+            </w:r>
+          </w:p>
+        </w:tc>
+        <w:tc>
+          <w:tcPr>
+            <w:tcW w:w="1110" w:type="dxa"/>
+            <w:shd w:val="clear" w:color="auto" w:fill="2E75B6"/>
+            <w:tcMar>
+              <w:top w:w="80" w:type="dxa"/>
+              <w:left w:w="120" w:type="dxa"/>
+              <w:bottom w:w="80" w:type="dxa"/>
+              <w:right w:w="120" w:type="dxa"/>
+            </w:tcMar>
+          </w:tcPr>
+          <w:p>
+            <w:r>
+              <w:rPr>
+                <w:b/>
+                <w:bCs/>
+                <w:color w:val="FFFFFF"/>
+                <w:sz w:val="20"/>
+                <w:szCs w:val="20"/>
+              </w:rPr>
               <w:t>Paper p99 (us)</w:t>
             </w:r>
           </w:p>
@@ -1956,7 +2465,7 @@
     <w:p/>
     <w:p>
       <w:r>
-        <w:t>Throughput rises from 3.06 to 9.75 Mops as the read ratio increases, in the same direction as the paper. The write-heavy workloads also show higher p99 latency, around 173 us. One possible explanation is the lack of PFC configuration for RoCE v2 on CloudLab's experiment network, although we did not directly measure retransmissions.</w:t>
+        <w:t xml:space="preserve">Throughput rises from 3.06 to 9.75 Mops as the read ratio increases, in the same direction as the paper. The write-heavy workloads also show higher p99 latency, around 173 us. </w:t>
       </w:r>
     </w:p>
     <w:p>
@@ -2093,7 +2602,15 @@
     </w:p>
     <w:p>
       <w:r>
-        <w:t>Workload: zipfian=0.99, 22 compute threads per node (44 total).</w:t>
+        <w:t xml:space="preserve">Workload: </w:t>
+      </w:r>
+      <w:proofErr w:type="spellStart"/>
+      <w:r>
+        <w:t>zipfian</w:t>
+      </w:r>
+      <w:proofErr w:type="spellEnd"/>
+      <w:r>
+        <w:t>=0.99, 22 compute threads per node (44 total).</w:t>
       </w:r>
     </w:p>
     <w:p/>
@@ -2209,22 +2726,9 @@
                 <w:sz w:val="20"/>
                 <w:szCs w:val="20"/>
               </w:rPr>
-              <w:t>Our Tput (Mops)</w:t>
-            </w:r>
-          </w:p>
-        </w:tc>
-        <w:tc>
-          <w:tcPr>
-            <w:tcW w:w="1000" w:type="dxa"/>
-            <w:shd w:val="clear" w:color="auto" w:fill="2E75B6"/>
-            <w:tcMar>
-              <w:top w:w="80" w:type="dxa"/>
-              <w:left w:w="120" w:type="dxa"/>
-              <w:bottom w:w="80" w:type="dxa"/>
-              <w:right w:w="120" w:type="dxa"/>
-            </w:tcMar>
-          </w:tcPr>
-          <w:p>
+              <w:t xml:space="preserve">Our </w:t>
+            </w:r>
+            <w:proofErr w:type="spellStart"/>
             <w:r>
               <w:rPr>
                 <w:b/>
@@ -2233,22 +2737,9 @@
                 <w:sz w:val="20"/>
                 <w:szCs w:val="20"/>
               </w:rPr>
-              <w:t>Paper (Mops)</w:t>
-            </w:r>
-          </w:p>
-        </w:tc>
-        <w:tc>
-          <w:tcPr>
-            <w:tcW w:w="1050" w:type="dxa"/>
-            <w:shd w:val="clear" w:color="auto" w:fill="2E75B6"/>
-            <w:tcMar>
-              <w:top w:w="80" w:type="dxa"/>
-              <w:left w:w="120" w:type="dxa"/>
-              <w:bottom w:w="80" w:type="dxa"/>
-              <w:right w:w="120" w:type="dxa"/>
-            </w:tcMar>
-          </w:tcPr>
-          <w:p>
+              <w:t>Tput</w:t>
+            </w:r>
+            <w:proofErr w:type="spellEnd"/>
             <w:r>
               <w:rPr>
                 <w:b/>
@@ -2257,13 +2748,13 @@
                 <w:sz w:val="20"/>
                 <w:szCs w:val="20"/>
               </w:rPr>
-              <w:t>Our p50 (us)</w:t>
-            </w:r>
-          </w:p>
-        </w:tc>
-        <w:tc>
-          <w:tcPr>
-            <w:tcW w:w="1050" w:type="dxa"/>
+              <w:t xml:space="preserve"> (Mops)</w:t>
+            </w:r>
+          </w:p>
+        </w:tc>
+        <w:tc>
+          <w:tcPr>
+            <w:tcW w:w="1000" w:type="dxa"/>
             <w:shd w:val="clear" w:color="auto" w:fill="2E75B6"/>
             <w:tcMar>
               <w:top w:w="80" w:type="dxa"/>
@@ -2281,13 +2772,13 @@
                 <w:sz w:val="20"/>
                 <w:szCs w:val="20"/>
               </w:rPr>
-              <w:t>Paper p50 (us)</w:t>
-            </w:r>
-          </w:p>
-        </w:tc>
-        <w:tc>
-          <w:tcPr>
-            <w:tcW w:w="1000" w:type="dxa"/>
+              <w:t>Paper (Mops)</w:t>
+            </w:r>
+          </w:p>
+        </w:tc>
+        <w:tc>
+          <w:tcPr>
+            <w:tcW w:w="1050" w:type="dxa"/>
             <w:shd w:val="clear" w:color="auto" w:fill="2E75B6"/>
             <w:tcMar>
               <w:top w:w="80" w:type="dxa"/>
@@ -2305,13 +2796,13 @@
                 <w:sz w:val="20"/>
                 <w:szCs w:val="20"/>
               </w:rPr>
-              <w:t>Our p99 (us)</w:t>
-            </w:r>
-          </w:p>
-        </w:tc>
-        <w:tc>
-          <w:tcPr>
-            <w:tcW w:w="1110" w:type="dxa"/>
+              <w:t>Our p50 (us)</w:t>
+            </w:r>
+          </w:p>
+        </w:tc>
+        <w:tc>
+          <w:tcPr>
+            <w:tcW w:w="1050" w:type="dxa"/>
             <w:shd w:val="clear" w:color="auto" w:fill="2E75B6"/>
             <w:tcMar>
               <w:top w:w="80" w:type="dxa"/>
@@ -2329,6 +2820,54 @@
                 <w:sz w:val="20"/>
                 <w:szCs w:val="20"/>
               </w:rPr>
+              <w:t>Paper p50 (us)</w:t>
+            </w:r>
+          </w:p>
+        </w:tc>
+        <w:tc>
+          <w:tcPr>
+            <w:tcW w:w="1000" w:type="dxa"/>
+            <w:shd w:val="clear" w:color="auto" w:fill="2E75B6"/>
+            <w:tcMar>
+              <w:top w:w="80" w:type="dxa"/>
+              <w:left w:w="120" w:type="dxa"/>
+              <w:bottom w:w="80" w:type="dxa"/>
+              <w:right w:w="120" w:type="dxa"/>
+            </w:tcMar>
+          </w:tcPr>
+          <w:p>
+            <w:r>
+              <w:rPr>
+                <w:b/>
+                <w:bCs/>
+                <w:color w:val="FFFFFF"/>
+                <w:sz w:val="20"/>
+                <w:szCs w:val="20"/>
+              </w:rPr>
+              <w:t>Our p99 (us)</w:t>
+            </w:r>
+          </w:p>
+        </w:tc>
+        <w:tc>
+          <w:tcPr>
+            <w:tcW w:w="1110" w:type="dxa"/>
+            <w:shd w:val="clear" w:color="auto" w:fill="2E75B6"/>
+            <w:tcMar>
+              <w:top w:w="80" w:type="dxa"/>
+              <w:left w:w="120" w:type="dxa"/>
+              <w:bottom w:w="80" w:type="dxa"/>
+              <w:right w:w="120" w:type="dxa"/>
+            </w:tcMar>
+          </w:tcPr>
+          <w:p>
+            <w:r>
+              <w:rPr>
+                <w:b/>
+                <w:bCs/>
+                <w:color w:val="FFFFFF"/>
+                <w:sz w:val="20"/>
+                <w:szCs w:val="20"/>
+              </w:rPr>
               <w:t>Paper p99 (us)</w:t>
             </w:r>
           </w:p>
@@ -2841,6 +3380,9 @@
     <w:p>
       <w:r>
         <w:t>The skewed results are almost identical to the uniform ones. Our p99 latency differs by barely anything between the two workloads (174 us versus 173 us), whereas the paper reports a much larger gap (1136 us versus 17.5 us). In our setup, this pattern is consistent with the reduced 8,192-entry lock table approaching saturation under both access patterns, which would obscure the separation seen in the paper.</w:t>
+      </w:r>
+      <w:r>
+        <w:t xml:space="preserve">                          </w:t>
       </w:r>
     </w:p>
     <w:p>
@@ -2983,7 +3525,31 @@
     </w:p>
     <w:p>
       <w:r>
-        <w:t>The lock table contains far fewer entries in our setup: kLockChipMemSize = 64KB, so kNumOfLock = 64*1024 / sizeof(uint64_t) = 8,192 entries, which is 16x fewer than the paper's 131,072. Part of that reduction comes from the open-source repository using uint64_t rather than the paper's 16-bit CAS-based representation.</w:t>
+        <w:t xml:space="preserve">The lock table contains far fewer entries in our setup: </w:t>
+      </w:r>
+      <w:proofErr w:type="spellStart"/>
+      <w:r>
+        <w:t>kLockChipMemSize</w:t>
+      </w:r>
+      <w:proofErr w:type="spellEnd"/>
+      <w:r>
+        <w:t xml:space="preserve"> = 64KB, so </w:t>
+      </w:r>
+      <w:proofErr w:type="spellStart"/>
+      <w:r>
+        <w:t>kNumOfLock</w:t>
+      </w:r>
+      <w:proofErr w:type="spellEnd"/>
+      <w:r>
+        <w:t xml:space="preserve"> = 64*1024 / </w:t>
+      </w:r>
+      <w:proofErr w:type="spellStart"/>
+      <w:r>
+        <w:t>sizeof</w:t>
+      </w:r>
+      <w:proofErr w:type="spellEnd"/>
+      <w:r>
+        <w:t>(uint64_t) = 8,192 entries, which is 16x fewer than the paper's 131,072. Part of that reduction comes from the open-source repository using uint64_t rather than the paper's 16-bit CAS-based representation.</w:t>
       </w:r>
     </w:p>
     <w:p/>
@@ -3113,7 +3679,21 @@
     <w:p/>
     <w:p>
       <w:r>
-        <w:t>Git history provides an additional sanity check. Commit bb57f76 (2026-02-15) changes zipfian from 0 to 0.99 in test/benchmark.cpp. The uniform results were collected before this commit and the skewed results after it, confirming that the two workloads were run from separate binaries.</w:t>
+        <w:t xml:space="preserve">Git history provides an additional sanity check. </w:t>
+      </w:r>
+      <w:r>
+        <w:t>It recorded</w:t>
+      </w:r>
+      <w:r>
+        <w:t xml:space="preserve"> changes </w:t>
+      </w:r>
+      <w:proofErr w:type="spellStart"/>
+      <w:r>
+        <w:t>zipfian</w:t>
+      </w:r>
+      <w:proofErr w:type="spellEnd"/>
+      <w:r>
+        <w:t xml:space="preserve"> from 0 to 0.99 in test/benchmark.cpp. The uniform results were collected before this commit and the skewed results after it, confirming that the two workloads were run from separate binaries.</w:t>
       </w:r>
     </w:p>
     <w:p/>
@@ -3127,19 +3707,33 @@
     </w:p>
     <w:p>
       <w:r>
-        <w:t xml:space="preserve">Several parts of the reproduction remain close to the paper. Throughput increases monotonically with read ratio for both uniform and skewed workloads (write-only &lt; write-intensive &lt; read-intensive), which matches Sherman's design. In the uniform table, p50 latency is also in the same single-digit-microsecond range as the paper for write-only (8.0 us versus 10.7 us) and write-intensive (6.5 us versus 8.0 us) </w:t>
+        <w:t xml:space="preserve">The reproduction matches the paper in the main directional trend: throughput increases as the read ratio rises for both uniform and skewed workloads. Some latency results are also close to the paper, especially p50 latency in the uniform workloads and p99 latency in the read-intensive workload. This </w:t>
       </w:r>
       <w:r>
         <w:lastRenderedPageBreak/>
-        <w:t>workloads, with gaps of roughly 19-25% relative to the paper values. That is consistent with some fast-path behavior being close to the paper, but we did not directly instrument RDMA verb counts or B+Tree traversal depth, so latency alone cannot establish those mechanisms. Uniform read-intensive p99 latency (12.9 us) is likewise very close to the paper's 12.1 us, which is consistent with reads bypassing the lock table.</w:t>
-      </w:r>
-    </w:p>
-    <w:p>
-      <w:r>
-        <w:t>The differences are also substantial. Absolute throughput is lower in every c6525 workload, but the size of the gap varies by workload; for example, uniform write-only reaches 3.06 Mops here versus 16.04 Mops in the paper. The clearest reason is scale: the paper uses 8 physical servers that emulate 8 Memory Server roles and 8 Compute Server roles, with 176 total client threads, while our setup uses 2 physical nodes and 44 threads. A 4x reduction in thread count would be expected to lower aggregate throughput accordingly. Another difference is that the paper's uniform/skewed throughput separation, such as 16.04 versus 4.14 Mops for write-only, disappears in our results, where both cases are 3.06 Mops. That pattern is consistent with lock-table saturation. With only 8,192 HOCL entries, or 16x fewer than the paper's 131,072, both access patterns may hit the same bottleneck and therefore lose the separation reported in the paper. We also see elevated p99 latency for uniform write-heavy workloads (173 us versus 17.5 us). One plausible explanation is that Priority Flow Control was not configured for RoCE v2 on the CloudLab experiment network, which could increase RDMA retransmission and inflate tail latency; the much less affected p50 is consistent with that explanation. Overall, we were not able to reproduce the paper's large separation between uniform and skewed write-heavy workloads, and reduced HOCL capacity remains the most plausible explanation supported by our setup and measurements.</w:t>
+        <w:t xml:space="preserve">suggests that parts of Sherman's fast path were preserved in our setup, although we did not directly instrument RDMA verb counts or </w:t>
+      </w:r>
+      <w:proofErr w:type="spellStart"/>
+      <w:r>
+        <w:t>B+Tree</w:t>
+      </w:r>
+      <w:proofErr w:type="spellEnd"/>
+      <w:r>
+        <w:t xml:space="preserve"> traversal behavior.</w:t>
       </w:r>
     </w:p>
     <w:p/>
+    <w:p>
+      <w:r>
+        <w:t>The main mismatch is that we could not reproduce the paper's separation between uniform and skewed write-heavy workloads. In the paper, skew greatly reduces write-heavy throughput and increases tail latency, but in our c6525-100g runs, uniform and skewed write-only workloads were almost identical. Absolute throughput was also lower, which is expected because the paper used 8 physical servers and 176 client threads, while our setup used 2 physical nodes and 44 total threads.</w:t>
+      </w:r>
+    </w:p>
+    <w:p/>
+    <w:p>
+      <w:r>
+        <w:t>The most plausible explanation is the smaller HOCL lock table in our environment. Our c6525-100g setup had only 8,192 HOCL entries, compared with 131,072 in the paper, so both uniform and skewed write-heavy workloads may have hit a similar lock-table bottleneck. We also observed elevated p99 latency in uniform write-heavy workloads, which may be related to the lack of Priority Flow Control for RoCE v2, although we did not directly measure retransmissions. Overall, the reproduction preserved the read-ratio trend but not the paper's workload-dependent uniform/skewed separation.</w:t>
+      </w:r>
+    </w:p>
     <w:p>
       <w:r>
         <w:rPr>
@@ -3195,7 +3789,23 @@
           <w:i/>
           <w:sz w:val="20"/>
         </w:rPr>
-        <w:t>Figure 7. Git history showing the zipfian change used for the skewed runs.</w:t>
+        <w:t xml:space="preserve">Figure 7. Git history showing the </w:t>
+      </w:r>
+      <w:proofErr w:type="spellStart"/>
+      <w:r>
+        <w:rPr>
+          <w:i/>
+          <w:sz w:val="20"/>
+        </w:rPr>
+        <w:t>zipfian</w:t>
+      </w:r>
+      <w:proofErr w:type="spellEnd"/>
+      <w:r>
+        <w:rPr>
+          <w:i/>
+          <w:sz w:val="20"/>
+        </w:rPr>
+        <w:t xml:space="preserve"> change used for the skewed runs.</w:t>
       </w:r>
     </w:p>
     <w:p/>
@@ -3209,11 +3819,7 @@
     </w:p>
     <w:p>
       <w:r>
-        <w:t>Section 4 established the main reproduction behavior on c6525-100g, but it also exposed the next question: could we examine remote-memory sensitivity more directly? The answer on c6525-100g was no, because the machine is single-socket and cannot provide a remote NUMA node. That limitation forced a pivot to r650. The move is important for two reasons. First, it enables the dual-socket CXL-style emulation that c6525-100g cannot support. Second, it turns the later stage of the project into a cross-</w:t>
-      </w:r>
-      <w:r>
-        <w:lastRenderedPageBreak/>
-        <w:t>platform comparison, because r650 changes socket topology, CPU family, NIC generation, and HOCL on-chip memory size at the same time.</w:t>
+        <w:t>Section 4 established the main reproduction behavior on c6525-100g, but it also exposed the next question: could we examine remote-memory sensitivity more directly? The answer on c6525-100g was no, because the machine is single-socket and cannot provide a remote NUMA node. That limitation forced a pivot to r650. The move is important for two reasons. First, it enables the dual-socket CXL-style emulation that c6525-100g cannot support. Second, it turns the later stage of the project into a cross-platform comparison, because r650 changes socket topology, CPU family, NIC generation, and HOCL on-chip memory size at the same time.</w:t>
       </w:r>
     </w:p>
     <w:p/>
@@ -3224,6 +3830,11 @@
       <w:r>
         <w:t>5.1 Why r650 Became the Follow-Up Platform</w:t>
       </w:r>
+    </w:p>
+    <w:p>
+      <w:pPr>
+        <w:pStyle w:val="Heading2"/>
+      </w:pPr>
     </w:p>
     <w:p>
       <w:pPr>
@@ -3235,6 +3846,7 @@
           <w:i/>
           <w:sz w:val="20"/>
         </w:rPr>
+        <w:lastRenderedPageBreak/>
         <w:t>Table 4. r650 baseline and CXL-emulated setup parameters.</w:t>
       </w:r>
     </w:p>
@@ -3346,12 +3958,21 @@
             </w:tcMar>
           </w:tcPr>
           <w:p>
-            <w:r>
-              <w:rPr>
-                <w:sz w:val="20"/>
-                <w:szCs w:val="20"/>
-              </w:rPr>
-              <w:t>CloudLab r650 (Clemson cluster)</w:t>
+            <w:proofErr w:type="spellStart"/>
+            <w:r>
+              <w:rPr>
+                <w:sz w:val="20"/>
+                <w:szCs w:val="20"/>
+              </w:rPr>
+              <w:t>CloudLab</w:t>
+            </w:r>
+            <w:proofErr w:type="spellEnd"/>
+            <w:r>
+              <w:rPr>
+                <w:sz w:val="20"/>
+                <w:szCs w:val="20"/>
+              </w:rPr>
+              <w:t xml:space="preserve"> r650 (Clemson cluster)</w:t>
             </w:r>
           </w:p>
         </w:tc>
@@ -3610,8 +4231,37 @@
             </w:tcMar>
           </w:tcPr>
           <w:p>
-            <w:r>
-              <w:t>Hugepage migration to NUMA node 1; numactl-based memory binding caused a bus error in the CXL-style run, so remote-memory placement was enforced through sysfs hugepage allocation instead.</w:t>
+            <w:proofErr w:type="spellStart"/>
+            <w:r>
+              <w:t>Hugepage</w:t>
+            </w:r>
+            <w:proofErr w:type="spellEnd"/>
+            <w:r>
+              <w:t xml:space="preserve"> migration to NUMA node 1; </w:t>
+            </w:r>
+            <w:proofErr w:type="spellStart"/>
+            <w:r>
+              <w:t>numactl</w:t>
+            </w:r>
+            <w:proofErr w:type="spellEnd"/>
+            <w:r>
+              <w:t xml:space="preserve">-based memory binding caused a bus error in the CXL-style run, so remote-memory placement was enforced through </w:t>
+            </w:r>
+            <w:proofErr w:type="spellStart"/>
+            <w:r>
+              <w:t>sysfs</w:t>
+            </w:r>
+            <w:proofErr w:type="spellEnd"/>
+            <w:r>
+              <w:t xml:space="preserve"> </w:t>
+            </w:r>
+            <w:proofErr w:type="spellStart"/>
+            <w:r>
+              <w:t>hugepage</w:t>
+            </w:r>
+            <w:proofErr w:type="spellEnd"/>
+            <w:r>
+              <w:t xml:space="preserve"> allocation instead.</w:t>
             </w:r>
           </w:p>
         </w:tc>
@@ -3620,7 +4270,27 @@
     <w:p/>
     <w:p>
       <w:r>
-        <w:t>On the r650, the NUMA distance ratio is 2.0x (20/10). Sherman itself required no code changes; the emulation is performed entirely at the OS level. Group 1, the r650 baseline, runs without NUMA binding. Group 2, the r650 CXL-emulated configuration, uses hugepage migration to place the Memory Server's data on node 1 (see Section 3.6). The r650 baseline also serves as more than a pre-CXL control. Because the project moved to r650 after the initial c6525-100g reproduction, it also provides a second platform for checking whether the c6525-100g behavior was tied to that single-socket machine alone.</w:t>
+        <w:t>On the r650, the NUMA distance ratio is 2.0x (20/10). Sherman itself required no code changes</w:t>
+      </w:r>
+      <w:r>
+        <w:t>.</w:t>
+      </w:r>
+      <w:r>
+        <w:t xml:space="preserve"> </w:t>
+      </w:r>
+      <w:r>
+        <w:t>T</w:t>
+      </w:r>
+      <w:r>
+        <w:t xml:space="preserve">he emulation is performed entirely at the OS level. Group 1, the r650 baseline, runs without NUMA binding. Group 2, the r650 CXL-emulated configuration, uses </w:t>
+      </w:r>
+      <w:proofErr w:type="spellStart"/>
+      <w:r>
+        <w:t>hugepage</w:t>
+      </w:r>
+      <w:proofErr w:type="spellEnd"/>
+      <w:r>
+        <w:t xml:space="preserve"> migration to place the Memory Server's data on node 1 (Section 3.6). The r650 baseline also serves as more than a pre-CXL control. Because the project moved to r650 after the initial c6525-100g reproduction, it also provides a second platform for checking whether the c6525-100g behavior was tied to that single-socket machine alone.</w:t>
       </w:r>
     </w:p>
     <w:p/>
@@ -3637,7 +4307,15 @@
         <w:pStyle w:val="Heading2"/>
       </w:pPr>
       <w:r>
-        <w:t>5.2.1 Uniform Workloads (zipfian=0)</w:t>
+        <w:t>5.2.1 Uniform Workloads (</w:t>
+      </w:r>
+      <w:proofErr w:type="spellStart"/>
+      <w:r>
+        <w:t>zipfian</w:t>
+      </w:r>
+      <w:proofErr w:type="spellEnd"/>
+      <w:r>
+        <w:t>=0)</w:t>
       </w:r>
     </w:p>
     <w:p>
@@ -3752,22 +4430,9 @@
                 <w:sz w:val="20"/>
                 <w:szCs w:val="20"/>
               </w:rPr>
-              <w:t>Our Tput (Mops)</w:t>
-            </w:r>
-          </w:p>
-        </w:tc>
-        <w:tc>
-          <w:tcPr>
-            <w:tcW w:w="1000" w:type="dxa"/>
-            <w:shd w:val="clear" w:color="auto" w:fill="2E75B6"/>
-            <w:tcMar>
-              <w:top w:w="80" w:type="dxa"/>
-              <w:left w:w="120" w:type="dxa"/>
-              <w:bottom w:w="80" w:type="dxa"/>
-              <w:right w:w="120" w:type="dxa"/>
-            </w:tcMar>
-          </w:tcPr>
-          <w:p>
+              <w:t xml:space="preserve">Our </w:t>
+            </w:r>
+            <w:proofErr w:type="spellStart"/>
             <w:r>
               <w:rPr>
                 <w:b/>
@@ -3776,22 +4441,9 @@
                 <w:sz w:val="20"/>
                 <w:szCs w:val="20"/>
               </w:rPr>
-              <w:t>Paper (Mops)</w:t>
-            </w:r>
-          </w:p>
-        </w:tc>
-        <w:tc>
-          <w:tcPr>
-            <w:tcW w:w="1050" w:type="dxa"/>
-            <w:shd w:val="clear" w:color="auto" w:fill="2E75B6"/>
-            <w:tcMar>
-              <w:top w:w="80" w:type="dxa"/>
-              <w:left w:w="120" w:type="dxa"/>
-              <w:bottom w:w="80" w:type="dxa"/>
-              <w:right w:w="120" w:type="dxa"/>
-            </w:tcMar>
-          </w:tcPr>
-          <w:p>
+              <w:t>Tput</w:t>
+            </w:r>
+            <w:proofErr w:type="spellEnd"/>
             <w:r>
               <w:rPr>
                 <w:b/>
@@ -3800,13 +4452,13 @@
                 <w:sz w:val="20"/>
                 <w:szCs w:val="20"/>
               </w:rPr>
-              <w:t>Our p50 (us)</w:t>
-            </w:r>
-          </w:p>
-        </w:tc>
-        <w:tc>
-          <w:tcPr>
-            <w:tcW w:w="1050" w:type="dxa"/>
+              <w:t xml:space="preserve"> (Mops)</w:t>
+            </w:r>
+          </w:p>
+        </w:tc>
+        <w:tc>
+          <w:tcPr>
+            <w:tcW w:w="1000" w:type="dxa"/>
             <w:shd w:val="clear" w:color="auto" w:fill="2E75B6"/>
             <w:tcMar>
               <w:top w:w="80" w:type="dxa"/>
@@ -3824,13 +4476,13 @@
                 <w:sz w:val="20"/>
                 <w:szCs w:val="20"/>
               </w:rPr>
-              <w:t>Paper p50 (us)</w:t>
-            </w:r>
-          </w:p>
-        </w:tc>
-        <w:tc>
-          <w:tcPr>
-            <w:tcW w:w="1000" w:type="dxa"/>
+              <w:t>Paper (Mops)</w:t>
+            </w:r>
+          </w:p>
+        </w:tc>
+        <w:tc>
+          <w:tcPr>
+            <w:tcW w:w="1050" w:type="dxa"/>
             <w:shd w:val="clear" w:color="auto" w:fill="2E75B6"/>
             <w:tcMar>
               <w:top w:w="80" w:type="dxa"/>
@@ -3848,13 +4500,13 @@
                 <w:sz w:val="20"/>
                 <w:szCs w:val="20"/>
               </w:rPr>
-              <w:t>Our p99 (us)</w:t>
-            </w:r>
-          </w:p>
-        </w:tc>
-        <w:tc>
-          <w:tcPr>
-            <w:tcW w:w="1110" w:type="dxa"/>
+              <w:t>Our p50 (us)</w:t>
+            </w:r>
+          </w:p>
+        </w:tc>
+        <w:tc>
+          <w:tcPr>
+            <w:tcW w:w="1050" w:type="dxa"/>
             <w:shd w:val="clear" w:color="auto" w:fill="2E75B6"/>
             <w:tcMar>
               <w:top w:w="80" w:type="dxa"/>
@@ -3872,6 +4524,54 @@
                 <w:sz w:val="20"/>
                 <w:szCs w:val="20"/>
               </w:rPr>
+              <w:t>Paper p50 (us)</w:t>
+            </w:r>
+          </w:p>
+        </w:tc>
+        <w:tc>
+          <w:tcPr>
+            <w:tcW w:w="1000" w:type="dxa"/>
+            <w:shd w:val="clear" w:color="auto" w:fill="2E75B6"/>
+            <w:tcMar>
+              <w:top w:w="80" w:type="dxa"/>
+              <w:left w:w="120" w:type="dxa"/>
+              <w:bottom w:w="80" w:type="dxa"/>
+              <w:right w:w="120" w:type="dxa"/>
+            </w:tcMar>
+          </w:tcPr>
+          <w:p>
+            <w:r>
+              <w:rPr>
+                <w:b/>
+                <w:bCs/>
+                <w:color w:val="FFFFFF"/>
+                <w:sz w:val="20"/>
+                <w:szCs w:val="20"/>
+              </w:rPr>
+              <w:t>Our p99 (us)</w:t>
+            </w:r>
+          </w:p>
+        </w:tc>
+        <w:tc>
+          <w:tcPr>
+            <w:tcW w:w="1110" w:type="dxa"/>
+            <w:shd w:val="clear" w:color="auto" w:fill="2E75B6"/>
+            <w:tcMar>
+              <w:top w:w="80" w:type="dxa"/>
+              <w:left w:w="120" w:type="dxa"/>
+              <w:bottom w:w="80" w:type="dxa"/>
+              <w:right w:w="120" w:type="dxa"/>
+            </w:tcMar>
+          </w:tcPr>
+          <w:p>
+            <w:r>
+              <w:rPr>
+                <w:b/>
+                <w:bCs/>
+                <w:color w:val="FFFFFF"/>
+                <w:sz w:val="20"/>
+                <w:szCs w:val="20"/>
+              </w:rPr>
               <w:t>Paper p99 (us)</w:t>
             </w:r>
           </w:p>
@@ -4235,7 +4935,6 @@
                 <w:sz w:val="20"/>
                 <w:szCs w:val="20"/>
               </w:rPr>
-              <w:lastRenderedPageBreak/>
               <w:t>Read-intensive</w:t>
             </w:r>
           </w:p>
@@ -4398,6 +5097,7 @@
         <w:rPr>
           <w:noProof/>
         </w:rPr>
+        <w:lastRenderedPageBreak/>
         <w:drawing>
           <wp:inline distT="0" distB="0" distL="0" distR="0" wp14:anchorId="1B000005" wp14:editId="77777777">
             <wp:extent cx="5486400" cy="3474720"/>
@@ -4456,7 +5156,15 @@
         <w:pStyle w:val="Heading2"/>
       </w:pPr>
       <w:r>
-        <w:t>5.2.2 Skewed Workloads (zipfian=0.99)</w:t>
+        <w:t>5.2.2 Skewed Workloads (</w:t>
+      </w:r>
+      <w:proofErr w:type="spellStart"/>
+      <w:r>
+        <w:t>zipfian</w:t>
+      </w:r>
+      <w:proofErr w:type="spellEnd"/>
+      <w:r>
+        <w:t>=0.99)</w:t>
       </w:r>
     </w:p>
     <w:p>
@@ -4571,7 +5279,29 @@
                 <w:sz w:val="20"/>
                 <w:szCs w:val="20"/>
               </w:rPr>
-              <w:t>Our Tput (Mops)</w:t>
+              <w:t xml:space="preserve">Our </w:t>
+            </w:r>
+            <w:proofErr w:type="spellStart"/>
+            <w:r>
+              <w:rPr>
+                <w:b/>
+                <w:bCs/>
+                <w:color w:val="FFFFFF"/>
+                <w:sz w:val="20"/>
+                <w:szCs w:val="20"/>
+              </w:rPr>
+              <w:t>Tput</w:t>
+            </w:r>
+            <w:proofErr w:type="spellEnd"/>
+            <w:r>
+              <w:rPr>
+                <w:b/>
+                <w:bCs/>
+                <w:color w:val="FFFFFF"/>
+                <w:sz w:val="20"/>
+                <w:szCs w:val="20"/>
+              </w:rPr>
+              <w:t xml:space="preserve"> (Mops)</w:t>
             </w:r>
           </w:p>
         </w:tc>
@@ -5355,22 +6085,9 @@
                 <w:sz w:val="20"/>
                 <w:szCs w:val="20"/>
               </w:rPr>
-              <w:t>c6525-100g Tput</w:t>
-            </w:r>
-          </w:p>
-        </w:tc>
-        <w:tc>
-          <w:tcPr>
-            <w:tcW w:w="1900" w:type="dxa"/>
-            <w:shd w:val="clear" w:color="auto" w:fill="2E75B6"/>
-            <w:tcMar>
-              <w:top w:w="80" w:type="dxa"/>
-              <w:left w:w="120" w:type="dxa"/>
-              <w:bottom w:w="80" w:type="dxa"/>
-              <w:right w:w="120" w:type="dxa"/>
-            </w:tcMar>
-          </w:tcPr>
-          <w:p>
+              <w:t xml:space="preserve">c6525-100g </w:t>
+            </w:r>
+            <w:proofErr w:type="spellStart"/>
             <w:r>
               <w:rPr>
                 <w:b/>
@@ -5379,8 +6096,9 @@
                 <w:sz w:val="20"/>
                 <w:szCs w:val="20"/>
               </w:rPr>
-              <w:t>r650 Baseline Tput</w:t>
-            </w:r>
+              <w:t>Tput</w:t>
+            </w:r>
+            <w:proofErr w:type="spellEnd"/>
           </w:p>
         </w:tc>
         <w:tc>
@@ -5403,22 +6121,9 @@
                 <w:sz w:val="20"/>
                 <w:szCs w:val="20"/>
               </w:rPr>
-              <w:t>c6525-100g p99 (us)</w:t>
-            </w:r>
-          </w:p>
-        </w:tc>
-        <w:tc>
-          <w:tcPr>
-            <w:tcW w:w="1660" w:type="dxa"/>
-            <w:shd w:val="clear" w:color="auto" w:fill="2E75B6"/>
-            <w:tcMar>
-              <w:top w:w="80" w:type="dxa"/>
-              <w:left w:w="120" w:type="dxa"/>
-              <w:bottom w:w="80" w:type="dxa"/>
-              <w:right w:w="120" w:type="dxa"/>
-            </w:tcMar>
-          </w:tcPr>
-          <w:p>
+              <w:t xml:space="preserve">r650 Baseline </w:t>
+            </w:r>
+            <w:proofErr w:type="spellStart"/>
             <w:r>
               <w:rPr>
                 <w:b/>
@@ -5427,6 +6132,55 @@
                 <w:sz w:val="20"/>
                 <w:szCs w:val="20"/>
               </w:rPr>
+              <w:t>Tput</w:t>
+            </w:r>
+            <w:proofErr w:type="spellEnd"/>
+          </w:p>
+        </w:tc>
+        <w:tc>
+          <w:tcPr>
+            <w:tcW w:w="1900" w:type="dxa"/>
+            <w:shd w:val="clear" w:color="auto" w:fill="2E75B6"/>
+            <w:tcMar>
+              <w:top w:w="80" w:type="dxa"/>
+              <w:left w:w="120" w:type="dxa"/>
+              <w:bottom w:w="80" w:type="dxa"/>
+              <w:right w:w="120" w:type="dxa"/>
+            </w:tcMar>
+          </w:tcPr>
+          <w:p>
+            <w:r>
+              <w:rPr>
+                <w:b/>
+                <w:bCs/>
+                <w:color w:val="FFFFFF"/>
+                <w:sz w:val="20"/>
+                <w:szCs w:val="20"/>
+              </w:rPr>
+              <w:t>c6525-100g p99 (us)</w:t>
+            </w:r>
+          </w:p>
+        </w:tc>
+        <w:tc>
+          <w:tcPr>
+            <w:tcW w:w="1660" w:type="dxa"/>
+            <w:shd w:val="clear" w:color="auto" w:fill="2E75B6"/>
+            <w:tcMar>
+              <w:top w:w="80" w:type="dxa"/>
+              <w:left w:w="120" w:type="dxa"/>
+              <w:bottom w:w="80" w:type="dxa"/>
+              <w:right w:w="120" w:type="dxa"/>
+            </w:tcMar>
+          </w:tcPr>
+          <w:p>
+            <w:r>
+              <w:rPr>
+                <w:b/>
+                <w:bCs/>
+                <w:color w:val="FFFFFF"/>
+                <w:sz w:val="20"/>
+                <w:szCs w:val="20"/>
+              </w:rPr>
               <w:t>r650 Baseline p99 (us)</w:t>
             </w:r>
           </w:p>
@@ -6078,11 +6832,16 @@
     <w:p/>
     <w:p>
       <w:r>
-        <w:t>The move to r650 was motivated by the CXL question, but the r650 baseline also gives us a useful cross-platform check against c6525-100g. Several factors change at once: socket topology, CPU family, NIC generation, and HOCL lock-table capacity. The comparison therefore does not isolate a single variable, but it is still informative. The r650 baseline has a larger lock table than c6525-100g, 16,384 entries versus 8,192, yet it still shows lower absolute throughput. One possible explanation is higher per-</w:t>
+        <w:t xml:space="preserve">The move to r650 was motivated by the CXL question, but the r650 baseline also gives us a useful cross-platform check against c6525-100g. Several factors change at once: socket topology, CPU family, NIC generation, and HOCL lock-table capacity. </w:t>
+      </w:r>
+    </w:p>
+    <w:p>
+      <w:r>
+        <w:t xml:space="preserve">The comparison therefore does not isolate a single variable, but it is still informative. The r650 baseline has a larger lock table than c6525-100g, 16,384 entries versus 8,192, yet it still shows lower absolute </w:t>
       </w:r>
       <w:r>
         <w:lastRenderedPageBreak/>
-        <w:t>operation RDMA latency on the Intel Xeon 8360Y platform, or cross-socket overhead even for nominally local memory accesses in a dual-socket machine. We did not isolate these factors, so they should be read as hypotheses rather than direct measurements.</w:t>
+        <w:t>throughput. One possible explanation is higher per-operation RDMA latency on the Intel Xeon 8360Y platform, or cross-socket overhead even for nominally local memory accesses in a dual-socket machine. We did not isolate these factors, so they should be read as hypotheses rather than direct measurements.</w:t>
       </w:r>
     </w:p>
     <w:p/>
@@ -6174,7 +6933,15 @@
         <w:pStyle w:val="Heading2"/>
       </w:pPr>
       <w:r>
-        <w:t>5.4.1 Uniform Workloads (zipfian=0)</w:t>
+        <w:t>5.4.1 Uniform Workloads (</w:t>
+      </w:r>
+      <w:proofErr w:type="spellStart"/>
+      <w:r>
+        <w:t>zipfian</w:t>
+      </w:r>
+      <w:proofErr w:type="spellEnd"/>
+      <w:r>
+        <w:t>=0)</w:t>
       </w:r>
     </w:p>
     <w:p>
@@ -6290,22 +7057,9 @@
                 <w:sz w:val="20"/>
                 <w:szCs w:val="20"/>
               </w:rPr>
-              <w:t>CXL Tput (Mops)</w:t>
-            </w:r>
-          </w:p>
-        </w:tc>
-        <w:tc>
-          <w:tcPr>
-            <w:tcW w:w="1260" w:type="dxa"/>
-            <w:shd w:val="clear" w:color="auto" w:fill="2E75B6"/>
-            <w:tcMar>
-              <w:top w:w="80" w:type="dxa"/>
-              <w:left w:w="120" w:type="dxa"/>
-              <w:bottom w:w="80" w:type="dxa"/>
-              <w:right w:w="120" w:type="dxa"/>
-            </w:tcMar>
-          </w:tcPr>
-          <w:p>
+              <w:t xml:space="preserve">CXL </w:t>
+            </w:r>
+            <w:proofErr w:type="spellStart"/>
             <w:r>
               <w:rPr>
                 <w:b/>
@@ -6314,7 +7068,64 @@
                 <w:sz w:val="20"/>
                 <w:szCs w:val="20"/>
               </w:rPr>
-              <w:t>Baseline Tput (Mops)</w:t>
+              <w:t>Tput</w:t>
+            </w:r>
+            <w:proofErr w:type="spellEnd"/>
+            <w:r>
+              <w:rPr>
+                <w:b/>
+                <w:bCs/>
+                <w:color w:val="FFFFFF"/>
+                <w:sz w:val="20"/>
+                <w:szCs w:val="20"/>
+              </w:rPr>
+              <w:t xml:space="preserve"> (Mops)</w:t>
+            </w:r>
+          </w:p>
+        </w:tc>
+        <w:tc>
+          <w:tcPr>
+            <w:tcW w:w="1260" w:type="dxa"/>
+            <w:shd w:val="clear" w:color="auto" w:fill="2E75B6"/>
+            <w:tcMar>
+              <w:top w:w="80" w:type="dxa"/>
+              <w:left w:w="120" w:type="dxa"/>
+              <w:bottom w:w="80" w:type="dxa"/>
+              <w:right w:w="120" w:type="dxa"/>
+            </w:tcMar>
+          </w:tcPr>
+          <w:p>
+            <w:r>
+              <w:rPr>
+                <w:b/>
+                <w:bCs/>
+                <w:color w:val="FFFFFF"/>
+                <w:sz w:val="20"/>
+                <w:szCs w:val="20"/>
+              </w:rPr>
+              <w:t xml:space="preserve">Baseline </w:t>
+            </w:r>
+            <w:proofErr w:type="spellStart"/>
+            <w:r>
+              <w:rPr>
+                <w:b/>
+                <w:bCs/>
+                <w:color w:val="FFFFFF"/>
+                <w:sz w:val="20"/>
+                <w:szCs w:val="20"/>
+              </w:rPr>
+              <w:t>Tput</w:t>
+            </w:r>
+            <w:proofErr w:type="spellEnd"/>
+            <w:r>
+              <w:rPr>
+                <w:b/>
+                <w:bCs/>
+                <w:color w:val="FFFFFF"/>
+                <w:sz w:val="20"/>
+                <w:szCs w:val="20"/>
+              </w:rPr>
+              <w:t xml:space="preserve"> (Mops)</w:t>
             </w:r>
           </w:p>
         </w:tc>
@@ -6993,7 +7804,15 @@
         <w:pStyle w:val="Heading2"/>
       </w:pPr>
       <w:r>
-        <w:t>5.4.2 Skewed Workloads (zipfian=0.99)</w:t>
+        <w:t>5.4.2 Skewed Workloads (</w:t>
+      </w:r>
+      <w:proofErr w:type="spellStart"/>
+      <w:r>
+        <w:t>zipfian</w:t>
+      </w:r>
+      <w:proofErr w:type="spellEnd"/>
+      <w:r>
+        <w:t>=0.99)</w:t>
       </w:r>
     </w:p>
     <w:p>
@@ -7108,22 +7927,9 @@
                 <w:sz w:val="20"/>
                 <w:szCs w:val="20"/>
               </w:rPr>
-              <w:t>CXL Tput (Mops)</w:t>
-            </w:r>
-          </w:p>
-        </w:tc>
-        <w:tc>
-          <w:tcPr>
-            <w:tcW w:w="1260" w:type="dxa"/>
-            <w:shd w:val="clear" w:color="auto" w:fill="2E75B6"/>
-            <w:tcMar>
-              <w:top w:w="80" w:type="dxa"/>
-              <w:left w:w="120" w:type="dxa"/>
-              <w:bottom w:w="80" w:type="dxa"/>
-              <w:right w:w="120" w:type="dxa"/>
-            </w:tcMar>
-          </w:tcPr>
-          <w:p>
+              <w:t xml:space="preserve">CXL </w:t>
+            </w:r>
+            <w:proofErr w:type="spellStart"/>
             <w:r>
               <w:rPr>
                 <w:b/>
@@ -7132,7 +7938,64 @@
                 <w:sz w:val="20"/>
                 <w:szCs w:val="20"/>
               </w:rPr>
-              <w:t>Baseline Tput (Mops)</w:t>
+              <w:t>Tput</w:t>
+            </w:r>
+            <w:proofErr w:type="spellEnd"/>
+            <w:r>
+              <w:rPr>
+                <w:b/>
+                <w:bCs/>
+                <w:color w:val="FFFFFF"/>
+                <w:sz w:val="20"/>
+                <w:szCs w:val="20"/>
+              </w:rPr>
+              <w:t xml:space="preserve"> (Mops)</w:t>
+            </w:r>
+          </w:p>
+        </w:tc>
+        <w:tc>
+          <w:tcPr>
+            <w:tcW w:w="1260" w:type="dxa"/>
+            <w:shd w:val="clear" w:color="auto" w:fill="2E75B6"/>
+            <w:tcMar>
+              <w:top w:w="80" w:type="dxa"/>
+              <w:left w:w="120" w:type="dxa"/>
+              <w:bottom w:w="80" w:type="dxa"/>
+              <w:right w:w="120" w:type="dxa"/>
+            </w:tcMar>
+          </w:tcPr>
+          <w:p>
+            <w:r>
+              <w:rPr>
+                <w:b/>
+                <w:bCs/>
+                <w:color w:val="FFFFFF"/>
+                <w:sz w:val="20"/>
+                <w:szCs w:val="20"/>
+              </w:rPr>
+              <w:t xml:space="preserve">Baseline </w:t>
+            </w:r>
+            <w:proofErr w:type="spellStart"/>
+            <w:r>
+              <w:rPr>
+                <w:b/>
+                <w:bCs/>
+                <w:color w:val="FFFFFF"/>
+                <w:sz w:val="20"/>
+                <w:szCs w:val="20"/>
+              </w:rPr>
+              <w:t>Tput</w:t>
+            </w:r>
+            <w:proofErr w:type="spellEnd"/>
+            <w:r>
+              <w:rPr>
+                <w:b/>
+                <w:bCs/>
+                <w:color w:val="FFFFFF"/>
+                <w:sz w:val="20"/>
+                <w:szCs w:val="20"/>
+              </w:rPr>
+              <w:t xml:space="preserve"> (Mops)</w:t>
             </w:r>
           </w:p>
         </w:tc>
@@ -7824,12 +8687,36 @@
     </w:p>
     <w:p>
       <w:r>
-        <w:t>With the original 1000 MB index-cache setting, the CXL throughput results are straightforward. For uniform workloads, the CXL-emulated runs are equal to or slightly above the baseline: write-only 3.46 versus 2.39 Mops, write-intensive 4.96 versus 4.42 Mops, and read-intensive 8.28 versus 8.26 Mops. For skewed workloads, all differences stay below 0.03 Mops. The uniform write-only anomaly, where CXL appears 45% faster than the baseline, is more consistent with run-to-run variance across separately provisioned CloudLab sessions than with a real CXL benefit. The skewed experiments, collected within a single session, show no directional bias, which is consistent with that interpretation, although it does not prove it. This initial run therefore shows that the default index-cache size can hide most of the emulated remote-memory effect.</w:t>
-      </w:r>
-    </w:p>
-    <w:p>
-      <w:r>
-        <w:t>To test that interpretation directly, we reduced define::kIndexCacheSize from 1000 MB to 4 MB. A preliminary 64 MB trial still produced near-99% cache hit rates, so the final cache-size sensitivity run used 4 MB. The r650 placement was otherwise the same NUMA-based CXL emulation: node0 ran the Memory Server and one Compute Server, node1 ran the second Compute Server, hugepages were placed on node1, and the NUMA distance ratio was 20/10 = 2.0x. Table 10 reports the last observed values from the 150-second runs. Because the cache hit rates were still rising through the end of each run, these values are not steady-state measurements.</w:t>
+        <w:t xml:space="preserve">With the original 1000 MB index-cache setting, the CXL throughput results are straightforward. For uniform workloads, the CXL-emulated runs are equal to or slightly above the baseline: write-only 3.46 versus 2.39 Mops, write-intensive 4.96 versus 4.42 Mops, and read-intensive 8.28 versus 8.26 Mops. For skewed workloads, all differences stay below 0.03 Mops. The uniform write-only anomaly, where CXL appears 45% faster than the baseline, is more consistent with run-to-run variance across separately provisioned </w:t>
+      </w:r>
+      <w:proofErr w:type="spellStart"/>
+      <w:r>
+        <w:t>CloudLab</w:t>
+      </w:r>
+      <w:proofErr w:type="spellEnd"/>
+      <w:r>
+        <w:t xml:space="preserve"> sessions than with a real CXL benefit. The skewed experiments, collected within a single session, show no directional bias, which is consistent with that interpretation, although it does not prove it. This initial run therefore shows that the default index-cache size can hide most of the emulated remote-memory effect.</w:t>
+      </w:r>
+    </w:p>
+    <w:p>
+      <w:r>
+        <w:t>To test that interpretation directly, we reduced define::</w:t>
+      </w:r>
+      <w:proofErr w:type="spellStart"/>
+      <w:r>
+        <w:t>kIndexCacheSize</w:t>
+      </w:r>
+      <w:proofErr w:type="spellEnd"/>
+      <w:r>
+        <w:t xml:space="preserve"> from 1000 MB to 4 MB. A preliminary 64 MB trial still produced near-99% cache hit rates, so the final cache-size sensitivity run used 4 MB. The r650 placement was otherwise the same NUMA-based CXL emulation: node0 ran the Memory Server and one Compute Server, node1 ran the second Compute Server, </w:t>
+      </w:r>
+      <w:proofErr w:type="spellStart"/>
+      <w:r>
+        <w:t>hugepages</w:t>
+      </w:r>
+      <w:proofErr w:type="spellEnd"/>
+      <w:r>
+        <w:t xml:space="preserve"> were placed on node1, and the NUMA distance ratio was 20/10 = 2.0x. Table 10 reports the last observed values from the 150-second runs. Because the cache hit rates were still rising through the end of each run, these values are not steady-state measurements.</w:t>
       </w:r>
     </w:p>
     <w:p>
@@ -7842,7 +8729,23 @@
           <w:i/>
           <w:sz w:val="20"/>
         </w:rPr>
-        <w:t>Table 10. r650 CXL-emulated cache-size sensitivity results with kIndexCacheSize = 4 MB.</w:t>
+        <w:t xml:space="preserve">Table 10. r650 CXL-emulated cache-size sensitivity results with </w:t>
+      </w:r>
+      <w:proofErr w:type="spellStart"/>
+      <w:r>
+        <w:rPr>
+          <w:i/>
+          <w:sz w:val="20"/>
+        </w:rPr>
+        <w:t>kIndexCacheSize</w:t>
+      </w:r>
+      <w:proofErr w:type="spellEnd"/>
+      <w:r>
+        <w:rPr>
+          <w:i/>
+          <w:sz w:val="20"/>
+        </w:rPr>
+        <w:t xml:space="preserve"> = 4 MB.</w:t>
       </w:r>
     </w:p>
     <w:tbl>
@@ -8375,6 +9278,7 @@
         </w:tc>
       </w:tr>
     </w:tbl>
+    <w:p/>
     <w:p>
       <w:r>
         <w:t>The reduced-cache run changes the interpretation of the earlier 99.9% result. With the larger index cache, all six workloads reached about 99.9% cache hit rate and the CXL-emulated throughput stayed close to the original high-hit-rate CXL run. With the 4 MB index cache, the hit rates dropped to roughly 32-65%, p99 latency increased for most workloads, and throughput was lower than the original CXL run for most workloads. Figures 12a and 12b compare the two CXL settings directly. This is consistent with the teacher's suggestion that the 1000 MB cache was absorbing most of the remote-DRAM effect. Because the 4 MB cache was still warming up, the result should be treated as sensitivity evidence rather than a final stable performance point.</w:t>
@@ -8508,22 +9412,37 @@
     </w:p>
     <w:p>
       <w:r>
-        <w:t>This report has two scopes: a reduced-scale reproduction of Sherman's main benchmark trends on CloudLab, and a broader but still limited analysis of lock-table capacity and remote-memory sensitivity. Across both parts, the core RDMA B+Tree functionality operated successfully on the available platforms.</w:t>
+        <w:t xml:space="preserve">This report has two scopes: a reduced-scale reproduction of Sherman's main benchmark trends on </w:t>
+      </w:r>
+      <w:proofErr w:type="spellStart"/>
+      <w:r>
+        <w:t>CloudLab</w:t>
+      </w:r>
+      <w:proofErr w:type="spellEnd"/>
+      <w:r>
+        <w:t xml:space="preserve">, and a limited sensitivity analysis of lock-table capacity and remote-memory effects. Across both parts, the core RDMA </w:t>
+      </w:r>
+      <w:proofErr w:type="spellStart"/>
+      <w:r>
+        <w:t>B+Tree</w:t>
+      </w:r>
+      <w:proofErr w:type="spellEnd"/>
+      <w:r>
+        <w:t xml:space="preserve"> functionality operated successfully on the available platforms.</w:t>
       </w:r>
     </w:p>
     <w:p/>
     <w:p>
       <w:r>
-        <w:t>The main deviation from the paper is the lock-table size: 8,192 entries on c6525-100g and 16,384 on r650, versus 131,072 in the paper. As a result, the study proceeds in two linked stages rather than on one fixed platform. c6525-100g provides the initial reproduction and exposes the missing uniform/skewed separation. r650 then becomes necessary for the dual-socket follow-up and, in doing so, also provides a cross-platform check. In both environments, uniform and skewed write-heavy workloads converge to nearly the same throughput and latency instead of diverging as reported in the paper. That pattern is consistent with lock-table saturation masking HOCL's advantage. Seeing the same behavior on two platforms makes a purely hardware-specific artifact less likely, although our experiments do not isolate lock-table size as the only cause.</w:t>
+        <w:t>The main deviation from the paper is the much smaller lock-table size: 8,192 entries on c6525-100g and 16,384 on r650, compared with 131,072 in the paper. On c6525-100g, the reproduction captured the general benchmark workflow but did not reproduce the paper's uniform/skewed separation under write-heavy workloads. The r650 experiments provided a second platform and a larger lock table, yet uniform and skewed write-heavy workloads still converged to similar throughput and latency. This repeated pattern is consistent with the interpretation that reduced effective HOCL capacity masked Sherman's expected skew advantage, although the experiments do not isolate lock-table size as the only cause.</w:t>
       </w:r>
     </w:p>
     <w:p/>
     <w:p>
       <w:r>
-        <w:t>In the extended analysis, NUMA-based CXL emulation via hugepage migration first measured about a 99.9% index-cache hit rate across all workloads and little measurable performance difference from the baseline. After reducing the index cache to 4 MB, the hit rate fell to roughly 32-65% during the 150-second runs and the remote-memory effect became more visible in latency and throughput. However, because the cache hit rates were still climbing, the 4 MB results should be interpreted as sensitivity evidence, not as steady-state performance. Overall, the results suggest that Sherman's HOCL behavior is sensitive to NIC on-chip memory capacity and the lock-entry representation used in the open-source code, while remote-memory sensitivity depends strongly on how much of the tree traversal the CS-side index cache absorbs.</w:t>
-      </w:r>
-    </w:p>
-    <w:p/>
+        <w:t>The remote-memory analysis also showed that the observed effect depends strongly on the CS-side index cache. With the original cache size, the measured index-cache hit rate stayed near 99.9% and remote-memory migration had little visible impact. After reducing the cache to 4 MB, hit rates fell to roughly 32-65% during the 150-second runs, and latency and throughput became more sensitive to remote memory. Because those hit rates were still rising, these results should be treated as sensitivity evidence rather than steady-state performance. Overall, the study supports a cautious conclusion: Sherman's behavior in this environment is shaped by both limited HOCL capacity and how much tree traversal is absorbed by the client-side index cache.</w:t>
+      </w:r>
+    </w:p>
     <w:p>
       <w:pPr>
         <w:pStyle w:val="Heading1"/>
@@ -8792,7 +9711,6 @@
                 <w:sz w:val="20"/>
                 <w:szCs w:val="20"/>
               </w:rPr>
-              <w:lastRenderedPageBreak/>
               <w:t>results/c6525_baseline/</w:t>
             </w:r>
           </w:p>
@@ -8854,6 +9772,7 @@
                 <w:sz w:val="20"/>
                 <w:szCs w:val="20"/>
               </w:rPr>
+              <w:lastRenderedPageBreak/>
               <w:t>results/r650_baseline/</w:t>
             </w:r>
           </w:p>
@@ -9043,12 +9962,53 @@
         <w:spacing w:after="0" w:line="240" w:lineRule="auto"/>
         <w:ind w:left="360"/>
       </w:pPr>
+      <w:proofErr w:type="spellStart"/>
       <w:r>
         <w:rPr>
           <w:rFonts w:ascii="Courier New" w:hAnsi="Courier New"/>
           <w:sz w:val="18"/>
         </w:rPr>
-        <w:t>sudo dpkg --remove --force-depends ibverbs-providers python3-pyverbs</w:t>
+        <w:t>sudo</w:t>
+      </w:r>
+      <w:proofErr w:type="spellEnd"/>
+      <w:r>
+        <w:rPr>
+          <w:rFonts w:ascii="Courier New" w:hAnsi="Courier New"/>
+          <w:sz w:val="18"/>
+        </w:rPr>
+        <w:t xml:space="preserve"> </w:t>
+      </w:r>
+      <w:proofErr w:type="spellStart"/>
+      <w:r>
+        <w:rPr>
+          <w:rFonts w:ascii="Courier New" w:hAnsi="Courier New"/>
+          <w:sz w:val="18"/>
+        </w:rPr>
+        <w:t>dpkg</w:t>
+      </w:r>
+      <w:proofErr w:type="spellEnd"/>
+      <w:r>
+        <w:rPr>
+          <w:rFonts w:ascii="Courier New" w:hAnsi="Courier New"/>
+          <w:sz w:val="18"/>
+        </w:rPr>
+        <w:t xml:space="preserve"> --remove --force-depends </w:t>
+      </w:r>
+      <w:proofErr w:type="spellStart"/>
+      <w:r>
+        <w:rPr>
+          <w:rFonts w:ascii="Courier New" w:hAnsi="Courier New"/>
+          <w:sz w:val="18"/>
+        </w:rPr>
+        <w:t>ibverbs</w:t>
+      </w:r>
+      <w:proofErr w:type="spellEnd"/>
+      <w:r>
+        <w:rPr>
+          <w:rFonts w:ascii="Courier New" w:hAnsi="Courier New"/>
+          <w:sz w:val="18"/>
+        </w:rPr>
+        <w:t>-providers python3-pyverbs</w:t>
       </w:r>
     </w:p>
     <w:p>
@@ -9056,12 +10016,37 @@
         <w:spacing w:after="0" w:line="240" w:lineRule="auto"/>
         <w:ind w:left="360"/>
       </w:pPr>
+      <w:proofErr w:type="spellStart"/>
       <w:r>
         <w:rPr>
           <w:rFonts w:ascii="Courier New" w:hAnsi="Courier New"/>
           <w:sz w:val="18"/>
         </w:rPr>
-        <w:t>sudo apt-mark hold ibverbs-providers python3-pyverbs</w:t>
+        <w:t>sudo</w:t>
+      </w:r>
+      <w:proofErr w:type="spellEnd"/>
+      <w:r>
+        <w:rPr>
+          <w:rFonts w:ascii="Courier New" w:hAnsi="Courier New"/>
+          <w:sz w:val="18"/>
+        </w:rPr>
+        <w:t xml:space="preserve"> apt-mark hold </w:t>
+      </w:r>
+      <w:proofErr w:type="spellStart"/>
+      <w:r>
+        <w:rPr>
+          <w:rFonts w:ascii="Courier New" w:hAnsi="Courier New"/>
+          <w:sz w:val="18"/>
+        </w:rPr>
+        <w:t>ibverbs</w:t>
+      </w:r>
+      <w:proofErr w:type="spellEnd"/>
+      <w:r>
+        <w:rPr>
+          <w:rFonts w:ascii="Courier New" w:hAnsi="Courier New"/>
+          <w:sz w:val="18"/>
+        </w:rPr>
+        <w:t>-providers python3-pyverbs</w:t>
       </w:r>
     </w:p>
     <w:p>
@@ -9069,12 +10054,53 @@
         <w:spacing w:after="0" w:line="240" w:lineRule="auto"/>
         <w:ind w:left="360"/>
       </w:pPr>
+      <w:proofErr w:type="spellStart"/>
       <w:r>
         <w:rPr>
           <w:rFonts w:ascii="Courier New" w:hAnsi="Courier New"/>
           <w:sz w:val="18"/>
         </w:rPr>
-        <w:t>sudo dpkg -i ${MLNX_LIBS}/libibverbs1_41mlnx1-*.deb</w:t>
+        <w:t>sudo</w:t>
+      </w:r>
+      <w:proofErr w:type="spellEnd"/>
+      <w:r>
+        <w:rPr>
+          <w:rFonts w:ascii="Courier New" w:hAnsi="Courier New"/>
+          <w:sz w:val="18"/>
+        </w:rPr>
+        <w:t xml:space="preserve"> </w:t>
+      </w:r>
+      <w:proofErr w:type="spellStart"/>
+      <w:r>
+        <w:rPr>
+          <w:rFonts w:ascii="Courier New" w:hAnsi="Courier New"/>
+          <w:sz w:val="18"/>
+        </w:rPr>
+        <w:t>dpkg</w:t>
+      </w:r>
+      <w:proofErr w:type="spellEnd"/>
+      <w:r>
+        <w:rPr>
+          <w:rFonts w:ascii="Courier New" w:hAnsi="Courier New"/>
+          <w:sz w:val="18"/>
+        </w:rPr>
+        <w:t xml:space="preserve"> -</w:t>
+      </w:r>
+      <w:proofErr w:type="spellStart"/>
+      <w:r>
+        <w:rPr>
+          <w:rFonts w:ascii="Courier New" w:hAnsi="Courier New"/>
+          <w:sz w:val="18"/>
+        </w:rPr>
+        <w:t>i</w:t>
+      </w:r>
+      <w:proofErr w:type="spellEnd"/>
+      <w:r>
+        <w:rPr>
+          <w:rFonts w:ascii="Courier New" w:hAnsi="Courier New"/>
+          <w:sz w:val="18"/>
+        </w:rPr>
+        <w:t xml:space="preserve"> ${MLNX_LIBS}/libibverbs1_41mlnx1-*.deb</w:t>
       </w:r>
     </w:p>
     <w:p>
@@ -9216,7 +10242,15 @@
         <w:pStyle w:val="Heading2"/>
       </w:pPr>
       <w:r>
-        <w:t>A.4 memcached Reset Before Each Run</w:t>
+        <w:t xml:space="preserve">A.4 </w:t>
+      </w:r>
+      <w:proofErr w:type="spellStart"/>
+      <w:r>
+        <w:t>memcached</w:t>
+      </w:r>
+      <w:proofErr w:type="spellEnd"/>
+      <w:r>
+        <w:t xml:space="preserve"> Reset Before Each Run</w:t>
       </w:r>
     </w:p>
     <w:p>
@@ -9234,7 +10268,39 @@
           <w:rFonts w:ascii="Courier New" w:hAnsi="Courier New"/>
           <w:sz w:val="18"/>
         </w:rPr>
-        <w:t>echo -e "flush_all\r\n" | nc 10.10.1.1 11211</w:t>
+        <w:t>echo -e "</w:t>
+      </w:r>
+      <w:proofErr w:type="spellStart"/>
+      <w:r>
+        <w:rPr>
+          <w:rFonts w:ascii="Courier New" w:hAnsi="Courier New"/>
+          <w:sz w:val="18"/>
+        </w:rPr>
+        <w:t>flush_all</w:t>
+      </w:r>
+      <w:proofErr w:type="spellEnd"/>
+      <w:r>
+        <w:rPr>
+          <w:rFonts w:ascii="Courier New" w:hAnsi="Courier New"/>
+          <w:sz w:val="18"/>
+        </w:rPr>
+        <w:t xml:space="preserve">\r\n" | </w:t>
+      </w:r>
+      <w:proofErr w:type="spellStart"/>
+      <w:r>
+        <w:rPr>
+          <w:rFonts w:ascii="Courier New" w:hAnsi="Courier New"/>
+          <w:sz w:val="18"/>
+        </w:rPr>
+        <w:t>nc</w:t>
+      </w:r>
+      <w:proofErr w:type="spellEnd"/>
+      <w:r>
+        <w:rPr>
+          <w:rFonts w:ascii="Courier New" w:hAnsi="Courier New"/>
+          <w:sz w:val="18"/>
+        </w:rPr>
+        <w:t xml:space="preserve"> 10.10.1.1 11211</w:t>
       </w:r>
     </w:p>
     <w:p>
@@ -9247,7 +10313,39 @@
           <w:rFonts w:ascii="Courier New" w:hAnsi="Courier New"/>
           <w:sz w:val="18"/>
         </w:rPr>
-        <w:t>echo -e "set serverNum 0 0 1\r\n0\r" | nc 10.10.1.1 11211</w:t>
+        <w:t xml:space="preserve">echo -e "set </w:t>
+      </w:r>
+      <w:proofErr w:type="spellStart"/>
+      <w:r>
+        <w:rPr>
+          <w:rFonts w:ascii="Courier New" w:hAnsi="Courier New"/>
+          <w:sz w:val="18"/>
+        </w:rPr>
+        <w:t>serverNum</w:t>
+      </w:r>
+      <w:proofErr w:type="spellEnd"/>
+      <w:r>
+        <w:rPr>
+          <w:rFonts w:ascii="Courier New" w:hAnsi="Courier New"/>
+          <w:sz w:val="18"/>
+        </w:rPr>
+        <w:t xml:space="preserve"> 0 0 1\r\n0\r" | </w:t>
+      </w:r>
+      <w:proofErr w:type="spellStart"/>
+      <w:r>
+        <w:rPr>
+          <w:rFonts w:ascii="Courier New" w:hAnsi="Courier New"/>
+          <w:sz w:val="18"/>
+        </w:rPr>
+        <w:t>nc</w:t>
+      </w:r>
+      <w:proofErr w:type="spellEnd"/>
+      <w:r>
+        <w:rPr>
+          <w:rFonts w:ascii="Courier New" w:hAnsi="Courier New"/>
+          <w:sz w:val="18"/>
+        </w:rPr>
+        <w:t xml:space="preserve"> 10.10.1.1 11211</w:t>
       </w:r>
     </w:p>
     <w:p>
@@ -9255,62 +10353,189 @@
         <w:pStyle w:val="Heading2"/>
       </w:pPr>
       <w:r>
-        <w:t>A.5 Cross-NUMA Hugepage Migration for CXL Emulation</w:t>
-      </w:r>
-    </w:p>
-    <w:p>
-      <w:r>
-        <w:t>The final r650 CXL-style setup used sysfs-level hugepage placement rather than numactl --membind=1. When the Memory Server process was forced onto NUMA node 1 with numactl --membind=1, the CXL-style run failed with a bus error. Separately, incorrect or incompatible memory placement can also surface around RDMA memory registration, such as ibv_reg_mr() failure. Moving the hugepage pool itself let Sherman allocate remote DRAM transparently for the CXL-style experiment.</w:t>
-      </w:r>
-    </w:p>
-    <w:p>
+        <w:t xml:space="preserve">A.5 Cross-NUMA </w:t>
+      </w:r>
+      <w:proofErr w:type="spellStart"/>
+      <w:r>
+        <w:t>Hugepage</w:t>
+      </w:r>
+      <w:proofErr w:type="spellEnd"/>
+      <w:r>
+        <w:t xml:space="preserve"> Migration for CXL Emulation</w:t>
+      </w:r>
+    </w:p>
+    <w:p>
+      <w:r>
+        <w:t xml:space="preserve">The final r650 CXL-style setup used </w:t>
+      </w:r>
+      <w:proofErr w:type="spellStart"/>
+      <w:r>
+        <w:t>sysfs</w:t>
+      </w:r>
+      <w:proofErr w:type="spellEnd"/>
+      <w:r>
+        <w:t xml:space="preserve">-level </w:t>
+      </w:r>
+      <w:proofErr w:type="spellStart"/>
+      <w:r>
+        <w:t>hugepage</w:t>
+      </w:r>
+      <w:proofErr w:type="spellEnd"/>
+      <w:r>
+        <w:t xml:space="preserve"> placement rather than </w:t>
+      </w:r>
+      <w:proofErr w:type="spellStart"/>
+      <w:r>
+        <w:t>numactl</w:t>
+      </w:r>
+      <w:proofErr w:type="spellEnd"/>
+      <w:r>
+        <w:t xml:space="preserve"> --</w:t>
+      </w:r>
+      <w:proofErr w:type="spellStart"/>
+      <w:r>
+        <w:t>membind</w:t>
+      </w:r>
+      <w:proofErr w:type="spellEnd"/>
+      <w:r>
+        <w:t xml:space="preserve">=1. When the Memory Server process was forced onto NUMA node 1 with </w:t>
+      </w:r>
+      <w:proofErr w:type="spellStart"/>
+      <w:r>
+        <w:t>numactl</w:t>
+      </w:r>
+      <w:proofErr w:type="spellEnd"/>
+      <w:r>
+        <w:t xml:space="preserve"> --</w:t>
+      </w:r>
+      <w:proofErr w:type="spellStart"/>
+      <w:r>
+        <w:t>membind</w:t>
+      </w:r>
+      <w:proofErr w:type="spellEnd"/>
+      <w:r>
+        <w:t>=1, the CXL-</w:t>
+      </w:r>
+      <w:r>
+        <w:lastRenderedPageBreak/>
+        <w:t xml:space="preserve">style run failed with a bus error. Separately, incorrect or incompatible memory placement can also surface around RDMA memory registration, such as </w:t>
+      </w:r>
+      <w:proofErr w:type="spellStart"/>
+      <w:r>
+        <w:t>ibv_reg_mr</w:t>
+      </w:r>
+      <w:proofErr w:type="spellEnd"/>
+      <w:r>
+        <w:t xml:space="preserve">() failure. Moving the </w:t>
+      </w:r>
+      <w:proofErr w:type="spellStart"/>
+      <w:r>
+        <w:t>hugepage</w:t>
+      </w:r>
+      <w:proofErr w:type="spellEnd"/>
+      <w:r>
+        <w:t xml:space="preserve"> pool itself let Sherman allocate remote DRAM transparently for the CXL-style experiment.</w:t>
+      </w:r>
+    </w:p>
+    <w:p>
+      <w:proofErr w:type="spellStart"/>
       <w:r>
         <w:rPr>
           <w:rFonts w:ascii="Courier New" w:eastAsia="Courier New" w:hAnsi="Courier New"/>
           <w:sz w:val="17"/>
         </w:rPr>
-        <w:t>numactl --hardware</w:t>
-      </w:r>
-    </w:p>
-    <w:p>
+        <w:t>numactl</w:t>
+      </w:r>
+      <w:proofErr w:type="spellEnd"/>
       <w:r>
         <w:rPr>
           <w:rFonts w:ascii="Courier New" w:eastAsia="Courier New" w:hAnsi="Courier New"/>
           <w:sz w:val="17"/>
         </w:rPr>
-        <w:t>sudo bash -c 'echo 0 &gt; /sys/devices/system/node/node0/hugepages/hugepages-2048kB/nr_hugepages'</w:t>
-      </w:r>
-    </w:p>
-    <w:p>
+        <w:t xml:space="preserve"> --hardware</w:t>
+      </w:r>
+    </w:p>
+    <w:p>
+      <w:proofErr w:type="spellStart"/>
       <w:r>
         <w:rPr>
           <w:rFonts w:ascii="Courier New" w:eastAsia="Courier New" w:hAnsi="Courier New"/>
           <w:sz w:val="17"/>
         </w:rPr>
-        <w:t>sudo bash -c 'echo 5120 &gt; /sys/devices/system/node/node1/hugepages/hugepages-2048kB/nr_hugepages'</w:t>
-      </w:r>
-    </w:p>
-    <w:p>
+        <w:t>sudo</w:t>
+      </w:r>
+      <w:proofErr w:type="spellEnd"/>
       <w:r>
         <w:rPr>
           <w:rFonts w:ascii="Courier New" w:eastAsia="Courier New" w:hAnsi="Courier New"/>
           <w:sz w:val="17"/>
         </w:rPr>
-        <w:t>cat /sys/devices/system/node/node0/hugepages/hugepages-2048kB/nr_hugepages  # expected: 0</w:t>
-      </w:r>
-    </w:p>
-    <w:p>
+        <w:t xml:space="preserve"> bash -c 'echo 0 &gt; /sys/devices/system/node/node0/hugepages/hugepages-2048kB/nr_hugepages'</w:t>
+      </w:r>
+    </w:p>
+    <w:p>
+      <w:proofErr w:type="spellStart"/>
       <w:r>
         <w:rPr>
           <w:rFonts w:ascii="Courier New" w:eastAsia="Courier New" w:hAnsi="Courier New"/>
           <w:sz w:val="17"/>
         </w:rPr>
+        <w:t>sudo</w:t>
+      </w:r>
+      <w:proofErr w:type="spellEnd"/>
+      <w:r>
+        <w:rPr>
+          <w:rFonts w:ascii="Courier New" w:eastAsia="Courier New" w:hAnsi="Courier New"/>
+          <w:sz w:val="17"/>
+        </w:rPr>
+        <w:t xml:space="preserve"> bash -c 'echo 5120 &gt; /sys/devices/system/node/node1/hugepages/hugepages-2048kB/nr_hugepages'</w:t>
+      </w:r>
+    </w:p>
+    <w:p>
+      <w:r>
+        <w:rPr>
+          <w:rFonts w:ascii="Courier New" w:eastAsia="Courier New" w:hAnsi="Courier New"/>
+          <w:sz w:val="17"/>
+        </w:rPr>
+        <w:t>cat /sys/devices/system/node/node0/hugepages/hugepages-2048kB/nr_hugepages  # expected: 0</w:t>
+      </w:r>
+    </w:p>
+    <w:p>
+      <w:r>
+        <w:rPr>
+          <w:rFonts w:ascii="Courier New" w:eastAsia="Courier New" w:hAnsi="Courier New"/>
+          <w:sz w:val="17"/>
+        </w:rPr>
         <w:t>cat /sys/devices/system/node/node1/hugepages/hugepages-2048kB/nr_hugepages  # expected: 5120</w:t>
       </w:r>
     </w:p>
     <w:p>
       <w:r>
-        <w:t>The verification output showed node0 hugepages set to 0 and node1 hugepages set to 5120, confirming that the Memory Server's 2MB hugepages were allocated on the remote NUMA node used for the emulation.</w:t>
+        <w:t xml:space="preserve">The verification output showed node0 </w:t>
+      </w:r>
+      <w:proofErr w:type="spellStart"/>
+      <w:r>
+        <w:t>hugepages</w:t>
+      </w:r>
+      <w:proofErr w:type="spellEnd"/>
+      <w:r>
+        <w:t xml:space="preserve"> set to 0 and node1 </w:t>
+      </w:r>
+      <w:proofErr w:type="spellStart"/>
+      <w:r>
+        <w:t>hugepages</w:t>
+      </w:r>
+      <w:proofErr w:type="spellEnd"/>
+      <w:r>
+        <w:t xml:space="preserve"> set to 5120, confirming that the Memory Server's 2MB </w:t>
+      </w:r>
+      <w:proofErr w:type="spellStart"/>
+      <w:r>
+        <w:t>hugepages</w:t>
+      </w:r>
+      <w:proofErr w:type="spellEnd"/>
+      <w:r>
+        <w:t xml:space="preserve"> were allocated on the remote NUMA node used for the emulation.</w:t>
       </w:r>
     </w:p>
     <w:p>
@@ -9361,7 +10586,55 @@
           <w:i/>
           <w:sz w:val="18"/>
         </w:rPr>
-        <w:t>Figure A3. r650 NUMA topology and sysfs hugepage placement check for the CXL-style emulation. The host exposes two NUMA nodes with distance 20 across sockets; after migration, node0 reports 0 hugepages and node1 reports 5120.</w:t>
+        <w:t xml:space="preserve">Figure A3. r650 NUMA topology and </w:t>
+      </w:r>
+      <w:proofErr w:type="spellStart"/>
+      <w:r>
+        <w:rPr>
+          <w:i/>
+          <w:sz w:val="18"/>
+        </w:rPr>
+        <w:t>sysfs</w:t>
+      </w:r>
+      <w:proofErr w:type="spellEnd"/>
+      <w:r>
+        <w:rPr>
+          <w:i/>
+          <w:sz w:val="18"/>
+        </w:rPr>
+        <w:t xml:space="preserve"> </w:t>
+      </w:r>
+      <w:proofErr w:type="spellStart"/>
+      <w:r>
+        <w:rPr>
+          <w:i/>
+          <w:sz w:val="18"/>
+        </w:rPr>
+        <w:t>hugepage</w:t>
+      </w:r>
+      <w:proofErr w:type="spellEnd"/>
+      <w:r>
+        <w:rPr>
+          <w:i/>
+          <w:sz w:val="18"/>
+        </w:rPr>
+        <w:t xml:space="preserve"> placement check for the CXL-style emulation. The host exposes two NUMA nodes with distance 20 across sockets; after migration, node0 reports 0 </w:t>
+      </w:r>
+      <w:proofErr w:type="spellStart"/>
+      <w:r>
+        <w:rPr>
+          <w:i/>
+          <w:sz w:val="18"/>
+        </w:rPr>
+        <w:t>hugepages</w:t>
+      </w:r>
+      <w:proofErr w:type="spellEnd"/>
+      <w:r>
+        <w:rPr>
+          <w:i/>
+          <w:sz w:val="18"/>
+        </w:rPr>
+        <w:t xml:space="preserve"> and node1 reports 5120.</w:t>
       </w:r>
     </w:p>
     <w:p/>
@@ -10019,6 +11292,7 @@
   <w:style w:type="character" w:default="1" w:styleId="DefaultParagraphFont">
     <w:name w:val="Default Paragraph Font"/>
     <w:uiPriority w:val="1"/>
+    <w:semiHidden/>
     <w:unhideWhenUsed/>
   </w:style>
   <w:style w:type="table" w:default="1" w:styleId="TableNormal">

</xml_diff>